<commit_message>
release: launch AgentGuard on BOT Chain Mainnet
</commit_message>
<xml_diff>
--- a/AgentGuard_Implementation_Plan.docx
+++ b/AgentGuard_Implementation_Plan.docx
@@ -12,7 +12,7 @@
         <w:pStyle w:val="Title"/>
       </w:pPr>
       <w:r>
-        <w:t>Rencana Implementasi AgentGuard pada BOT Chain</w:t>
+        <w:t>AgentGuard Implementation Plan for BOT Chain</w:t>
       </w:r>
     </w:p>
     <w:p>
@@ -20,7 +20,7 @@
         <w:pStyle w:val="Subtitle"/>
       </w:pPr>
       <w:r>
-        <w:t>Preparation Development Production dan Deployment</w:t>
+        <w:t>Preparation, Development, Production, and Deployment</w:t>
       </w:r>
     </w:p>
     <w:p>
@@ -31,7 +31,7 @@
         <w:rPr>
           <w:sz w:val="24"/>
         </w:rPr>
-        <w:t>Dokumen ini menjadi pedoman pelaksanaan AgentGuard sebagai DApp pembayaran berbasis instruksi bahasa natural. Model AI menerjemahkan instruksi menjadi intent terstruktur, smart contract menegakkan kebijakan pembayaran, dan pengguna tetap memberikan persetujuan akhir melalui MetaMask.</w:t>
+        <w:t>This document guides the implementation of AgentGuard as a payment DApp driven by natural-language instructions. The AI model translates instructions into structured intents, the smart contract enforces payment policies, and users provide final approval through MetaMask.</w:t>
       </w:r>
     </w:p>
     <w:tbl>
@@ -80,7 +80,7 @@
                 <w:color w:val="FFFFFF"/>
                 <w:sz w:val="18"/>
               </w:rPr>
-              <w:t>Atribut</w:t>
+              <w:t>Attributes</w:t>
             </w:r>
           </w:p>
         </w:tc>
@@ -106,7 +106,7 @@
                 <w:color w:val="FFFFFF"/>
                 <w:sz w:val="18"/>
               </w:rPr>
-              <w:t>Keputusan</w:t>
+              <w:t>Decisions</w:t>
             </w:r>
           </w:p>
         </w:tc>
@@ -157,7 +157,7 @@
               <w:rPr>
                 <w:sz w:val="19"/>
               </w:rPr>
-              <w:t>Build Week Hackathon Vol 2</w:t>
+              <w:t>Build Week Hackathon Vol. 2</w:t>
             </w:r>
           </w:p>
         </w:tc>
@@ -210,7 +210,7 @@
               <w:rPr>
                 <w:sz w:val="19"/>
               </w:rPr>
-              <w:t>BOT Chain testnet dan mainnet</w:t>
+              <w:t>BOT Chain testnet and mainnet</w:t>
             </w:r>
           </w:p>
         </w:tc>
@@ -238,7 +238,7 @@
               <w:rPr>
                 <w:sz w:val="19"/>
               </w:rPr>
-              <w:t>Integrasi</w:t>
+              <w:t>The integration</w:t>
             </w:r>
           </w:p>
         </w:tc>
@@ -261,7 +261,7 @@
               <w:rPr>
                 <w:sz w:val="19"/>
               </w:rPr>
-              <w:t>Backend ai-agent-workspace dan frontend web AgentGuard</w:t>
+              <w:t>Backend ai-agent-workspace and web frontend AgentGuard</w:t>
             </w:r>
           </w:p>
         </w:tc>
@@ -314,7 +314,7 @@
               <w:rPr>
                 <w:sz w:val="19"/>
               </w:rPr>
-              <w:t>Oracle Cloud Ubuntu ARM Ampere A1 4 OCPU dan 24 GB RAM</w:t>
+              <w:t>Oracle Cloud Ubuntu ARM Ampere A1 4 OCPU and 24 GB of RAM</w:t>
             </w:r>
           </w:p>
         </w:tc>
@@ -365,7 +365,7 @@
               <w:rPr>
                 <w:sz w:val="19"/>
               </w:rPr>
-              <w:t>BOT Chain sebagai sumber kebenaran dan SQLite untuk operasi backend</w:t>
+              <w:t>BOT Chain as a source of truth and SQLite for backend operations</w:t>
             </w:r>
           </w:p>
         </w:tc>
@@ -394,7 +394,7 @@
               <w:rPr>
                 <w:sz w:val="19"/>
               </w:rPr>
-              <w:t>Tanggal dokumen</w:t>
+              <w:t>Document Date</w:t>
             </w:r>
           </w:p>
         </w:tc>
@@ -418,7 +418,7 @@
               <w:rPr>
                 <w:sz w:val="19"/>
               </w:rPr>
-              <w:t>13 September 2026</w:t>
+              <w:t>13th of September 2026</w:t>
             </w:r>
           </w:p>
         </w:tc>
@@ -437,10 +437,10 @@
         <w:rPr>
           <w:b/>
         </w:rPr>
-        <w:t>Keputusan utama:</w:t>
-      </w:r>
-      <w:r>
-        <w:t xml:space="preserve"> tim membangun satu alur pembayaran BOT yang berfungsi dari awal sampai akhir. Fitur tambahan hanya dikerjakan setelah alur utama stabil di testnet dan mainnet.</w:t>
+        <w:t>Key Decision:</w:t>
+      </w:r>
+      <w:r>
+        <w:t xml:space="preserve">The team will build one complete BOT payment flow from start to finish. Additional features will be developed only after the main flow is stable on testnet and mainnet.</w:t>
       </w:r>
     </w:p>
     <w:p>
@@ -450,7 +450,7 @@
       </w:pPr>
       <w:r>
         <w:lastRenderedPageBreak/>
-        <w:t>Daftar Isi</w:t>
+        <w:t>Table of Contents</w:t>
       </w:r>
     </w:p>
     <w:p>
@@ -459,7 +459,7 @@
         <w:ind w:left="374" w:hanging="374"/>
       </w:pPr>
       <w:r>
-        <w:t>1.  Ringkasan Eksekutif</w:t>
+        <w:t>1.  Executive summary</w:t>
       </w:r>
     </w:p>
     <w:p>
@@ -468,7 +468,7 @@
         <w:ind w:left="374" w:hanging="374"/>
       </w:pPr>
       <w:r>
-        <w:t>2.  Sasaran dan Batas MVP</w:t>
+        <w:t>2.  MVP Goals and Scope</w:t>
       </w:r>
     </w:p>
     <w:p>
@@ -477,7 +477,7 @@
         <w:ind w:left="374" w:hanging="374"/>
       </w:pPr>
       <w:r>
-        <w:t>3.  Arsitektur Sistem</w:t>
+        <w:t>3.  System Architecture</w:t>
       </w:r>
     </w:p>
     <w:p>
@@ -486,7 +486,7 @@
         <w:ind w:left="374" w:hanging="374"/>
       </w:pPr>
       <w:r>
-        <w:t>4.  Fase Preparation</w:t>
+        <w:t>4.  Preparation Phase</w:t>
       </w:r>
     </w:p>
     <w:p>
@@ -495,7 +495,7 @@
         <w:ind w:left="374" w:hanging="374"/>
       </w:pPr>
       <w:r>
-        <w:t>5.  Fase Development</w:t>
+        <w:t>5.  Development Phase</w:t>
       </w:r>
     </w:p>
     <w:p>
@@ -504,7 +504,7 @@
         <w:ind w:left="374" w:hanging="374"/>
       </w:pPr>
       <w:r>
-        <w:t>6.  Fase Production</w:t>
+        <w:t>6.  Production Phase</w:t>
       </w:r>
     </w:p>
     <w:p>
@@ -513,7 +513,7 @@
         <w:ind w:left="374" w:hanging="374"/>
       </w:pPr>
       <w:r>
-        <w:t>7.  Fase Deployment</w:t>
+        <w:t>7.  Deployment Phase</w:t>
       </w:r>
     </w:p>
     <w:p>
@@ -522,7 +522,7 @@
         <w:ind w:left="374" w:hanging="374"/>
       </w:pPr>
       <w:r>
-        <w:t>8.  Pengujian dan Penerimaan</w:t>
+        <w:t>8.  Testing and Acceptance</w:t>
       </w:r>
     </w:p>
     <w:p>
@@ -531,7 +531,7 @@
         <w:ind w:left="374" w:hanging="374"/>
       </w:pPr>
       <w:r>
-        <w:t>9.  Jadwal Pelaksanaan</w:t>
+        <w:t>9.  Implementation Schedule</w:t>
       </w:r>
     </w:p>
     <w:p>
@@ -540,7 +540,7 @@
         <w:ind w:left="374" w:hanging="374"/>
       </w:pPr>
       <w:r>
-        <w:t>10.  Risiko dan Mitigasi</w:t>
+        <w:t>10.  Risks and Mitigations</w:t>
       </w:r>
     </w:p>
     <w:p>
@@ -549,7 +549,7 @@
         <w:ind w:left="374" w:hanging="374"/>
       </w:pPr>
       <w:r>
-        <w:t>11.  Checklist Submission</w:t>
+        <w:t>11.  Submission checklist</w:t>
       </w:r>
     </w:p>
     <w:p>
@@ -558,7 +558,7 @@
         <w:ind w:left="374" w:hanging="374"/>
       </w:pPr>
       <w:r>
-        <w:t>12.  Operasi Setelah Lomba</w:t>
+        <w:t>12.  Post-Hackathon Operations</w:t>
       </w:r>
     </w:p>
     <w:p>
@@ -567,7 +567,7 @@
         <w:ind w:left="374" w:hanging="374"/>
       </w:pPr>
       <w:r>
-        <w:t>13.  Lampiran Konfigurasi dan Referensi</w:t>
+        <w:t>13.  Configuration and Reference Appendices</w:t>
       </w:r>
     </w:p>
     <w:p>
@@ -575,7 +575,7 @@
         <w:pStyle w:val="Heading1"/>
       </w:pPr>
       <w:r>
-        <w:t>1 Ringkasan Eksekutif</w:t>
+        <w:t>1 Executive Summary</w:t>
       </w:r>
     </w:p>
     <w:p>
@@ -583,7 +583,7 @@
         <w:pStyle w:val="BodyText"/>
       </w:pPr>
       <w:r>
-        <w:t>AgentGuard membantu pengguna menyiapkan pembayaran BOT melalui perintah bahasa natural. Model AI hanya mengekstrak aksi, alamat penerima, nominal, dan tujuan pembayaran. Backend kemudian memvalidasi format dan mensimulasikan kebijakan. Smart contract menentukan apakah transaksi memenuhi batas per transaksi, batas harian, daftar penerima, masa berlaku, dan status pause. MetaMask tetap meminta persetujuan pengguna sebelum transaksi dikirim.</w:t>
+        <w:t>AgentGuard helps users prepare BOT payments through natural-language commands. The AI model extracts only the action, recipient address, amount, and payment purpose. The backend then validates the format and simulates the policy. The smart contract determines whether the transaction complies with the per-transaction limit, daily limit, recipient allowlist, expiration time, and pause status. MetaMask still requires user approval before the transaction is sent.</w:t>
       </w:r>
     </w:p>
     <w:p>
@@ -591,7 +591,7 @@
         <w:pStyle w:val="BodyText"/>
       </w:pPr>
       <w:r>
-        <w:t>Arsitektur memisahkan frontend publik, backend AI, dan settlement blockchain. Frontend React atau Vite dipublikasikan melalui GitHub Pages dengan custom domain. FastAPI berjalan pada Oracle Cloud. Frontend membaca state kontrak dan mengirim transaksi langsung melalui MetaMask, sedangkan backend tidak menyimpan private key pengguna.</w:t>
+        <w:t>The architecture separates the public frontend, AI backend, and blockchain settlement. The React or Vite frontend is published through GitHub Pages with a custom domain. FastAPI runs on Oracle Cloud. The frontend reads contract state and sends transactions directly through MetaMask, while the backend never stores user private keys.</w:t>
       </w:r>
     </w:p>
     <w:p>
@@ -599,7 +599,7 @@
         <w:pStyle w:val="BodyText"/>
       </w:pPr>
       <w:r>
-        <w:t>Keberhasilan proyek diukur dari satu demonstrasi yang dapat diulang: juri membuka domain, menghubungkan wallet, membuat atau membaca policy, memasukkan instruksi pembayaran, memeriksa preview, menandatangani transaksi, dan melihat hasilnya di BOT Chain Explorer.</w:t>
+        <w:t>Project success is measured by one repeatable demonstration: the judges open the domain, connect a wallet, create or read a policy, enter a payment instruction, review the preview, sign the transaction, and view the result in BOT Chain Explorer.</w:t>
       </w:r>
     </w:p>
     <w:p>
@@ -609,7 +609,7 @@
       </w:pPr>
       <w:r>
         <w:lastRenderedPageBreak/>
-        <w:t>Keputusan Teknis</w:t>
+        <w:t>Technical Decisions</w:t>
       </w:r>
     </w:p>
     <w:tbl>
@@ -685,7 +685,7 @@
                 <w:color w:val="FFFFFF"/>
                 <w:sz w:val="18"/>
               </w:rPr>
-              <w:t>Keputusan</w:t>
+              <w:t>Decision</w:t>
             </w:r>
           </w:p>
         </w:tc>
@@ -711,7 +711,7 @@
                 <w:color w:val="FFFFFF"/>
                 <w:sz w:val="18"/>
               </w:rPr>
-              <w:t>Alasan</w:t>
+              <w:t>Rationale</w:t>
             </w:r>
           </w:p>
         </w:tc>
@@ -762,7 +762,7 @@
               <w:rPr>
                 <w:sz w:val="17"/>
               </w:rPr>
-              <w:t>Solidity pada BOT Chain</w:t>
+              <w:t>Solidity on the BOT Chain</w:t>
             </w:r>
           </w:p>
         </w:tc>
@@ -785,7 +785,7 @@
               <w:rPr>
                 <w:sz w:val="17"/>
               </w:rPr>
-              <w:t>Memenuhi persyaratan deployment dan audit on chain</w:t>
+              <w:t>Meets deployment and on-chain audit requirements</w:t>
             </w:r>
           </w:p>
         </w:tc>
@@ -838,7 +838,7 @@
               <w:rPr>
                 <w:sz w:val="17"/>
               </w:rPr>
-              <w:t>MetaMask dengan ethers.js atau viem</w:t>
+              <w:t>MetaMask with ethers.js or viem</w:t>
             </w:r>
           </w:p>
         </w:tc>
@@ -862,7 +862,7 @@
               <w:rPr>
                 <w:sz w:val="17"/>
               </w:rPr>
-              <w:t>Dapat diuji langsung oleh juri</w:t>
+              <w:t>Can be tested directly by the judges</w:t>
             </w:r>
           </w:p>
         </w:tc>
@@ -913,7 +913,7 @@
               <w:rPr>
                 <w:sz w:val="17"/>
               </w:rPr>
-              <w:t>Ollama ARM64 dengan parser intent terstruktur</w:t>
+              <w:t>Ollama ARM64 with structured intent parser</w:t>
             </w:r>
           </w:p>
         </w:tc>
@@ -936,7 +936,7 @@
               <w:rPr>
                 <w:sz w:val="17"/>
               </w:rPr>
-              <w:t>Menggunakan fondasi ai-agent-workspace dan menjaga biaya rendah</w:t>
+              <w:t>Uses the ai-agent-workspace foundation while keeping costs low</w:t>
             </w:r>
           </w:p>
         </w:tc>
@@ -965,7 +965,7 @@
               <w:rPr>
                 <w:sz w:val="17"/>
               </w:rPr>
-              <w:t>Fallback</w:t>
+              <w:t>The fallback</w:t>
             </w:r>
           </w:p>
         </w:tc>
@@ -989,7 +989,7 @@
               <w:rPr>
                 <w:sz w:val="17"/>
               </w:rPr>
-              <w:t>Form manual untuk alamat dan nominal</w:t>
+              <w:t>Manual form for the address and amount</w:t>
             </w:r>
           </w:p>
         </w:tc>
@@ -1013,7 +1013,7 @@
               <w:rPr>
                 <w:sz w:val="17"/>
               </w:rPr>
-              <w:t>Main action tetap tersedia ketika model gagal</w:t>
+              <w:t>Main action remains available when the model fails</w:t>
             </w:r>
           </w:p>
         </w:tc>
@@ -1064,7 +1064,7 @@
               <w:rPr>
                 <w:sz w:val="17"/>
               </w:rPr>
-              <w:t>SQLite dengan WAL</w:t>
+              <w:t>SQLite with WAL</w:t>
             </w:r>
           </w:p>
         </w:tc>
@@ -1087,7 +1087,7 @@
               <w:rPr>
                 <w:sz w:val="17"/>
               </w:rPr>
-              <w:t>Cukup untuk session dan audit operasional skala demo</w:t>
+              <w:t>Sufficient for demo-scale sessions and operational audits</w:t>
             </w:r>
           </w:p>
         </w:tc>
@@ -1140,7 +1140,7 @@
               <w:rPr>
                 <w:sz w:val="17"/>
               </w:rPr>
-              <w:t>Web terpisah dari Electron</w:t>
+              <w:t>Web separated from Electron</w:t>
             </w:r>
           </w:p>
         </w:tc>
@@ -1164,7 +1164,7 @@
               <w:rPr>
                 <w:sz w:val="17"/>
               </w:rPr>
-              <w:t>Submission memerlukan live website</w:t>
+              <w:t>Submission requires a live website</w:t>
             </w:r>
           </w:p>
         </w:tc>
@@ -1215,7 +1215,7 @@
               <w:rPr>
                 <w:sz w:val="17"/>
               </w:rPr>
-              <w:t>Ampere A1 4 OCPU dan 24 GB</w:t>
+              <w:t>Ampere A1 4 OCPU and 24 GB</w:t>
             </w:r>
           </w:p>
         </w:tc>
@@ -1238,7 +1238,7 @@
               <w:rPr>
                 <w:sz w:val="17"/>
               </w:rPr>
-              <w:t>Cukup untuk backend dan model quantized selama lomba</w:t>
+              <w:t>Sufficient for the backend and a quantized model during the hackathon</w:t>
             </w:r>
           </w:p>
         </w:tc>
@@ -1254,7 +1254,7 @@
         <w:pStyle w:val="Heading1"/>
       </w:pPr>
       <w:r>
-        <w:t>2 Sasaran dan Batas MVP</w:t>
+        <w:t>2 MVP Goals and Scope</w:t>
       </w:r>
     </w:p>
     <w:p>
@@ -1262,7 +1262,7 @@
         <w:pStyle w:val="Heading2"/>
       </w:pPr>
       <w:r>
-        <w:t>Sasaran Produk</w:t>
+        <w:t>Product Goals</w:t>
       </w:r>
     </w:p>
     <w:p>
@@ -1270,7 +1270,7 @@
         <w:pStyle w:val="ListBullet"/>
       </w:pPr>
       <w:r>
-        <w:t>Pengguna dapat menghubungkan MetaMask pada BOT Chain testnet atau mainnet.</w:t>
+        <w:t>Users can connect MetaMask to the BOT Chain testnet or mainnet.</w:t>
       </w:r>
     </w:p>
     <w:p>
@@ -1278,7 +1278,7 @@
         <w:pStyle w:val="ListBullet"/>
       </w:pPr>
       <w:r>
-        <w:t>Pengguna dapat menetapkan batas pembayaran pada smart contract.</w:t>
+        <w:t>Users can set payment limits in the smart contract.</w:t>
       </w:r>
     </w:p>
     <w:p>
@@ -1286,7 +1286,7 @@
         <w:pStyle w:val="ListBullet"/>
       </w:pPr>
       <w:r>
-        <w:t>AI dapat mengubah satu instruksi pembayaran menjadi JSON yang tervalidasi.</w:t>
+        <w:t>AI can convert one payment instruction into validated JSON.</w:t>
       </w:r>
     </w:p>
     <w:p>
@@ -1294,7 +1294,7 @@
         <w:pStyle w:val="ListBullet"/>
       </w:pPr>
       <w:r>
-        <w:t>Frontend selalu menampilkan preview sebelum meminta signature.</w:t>
+        <w:t>The frontend always displays a preview before asking for a signature.</w:t>
       </w:r>
     </w:p>
     <w:p>
@@ -1302,7 +1302,7 @@
         <w:pStyle w:val="ListBullet"/>
       </w:pPr>
       <w:r>
-        <w:t>Smart contract menerima transaksi valid dan menolak transaksi yang melanggar policy.</w:t>
+        <w:t>The smart contract accepts valid transactions and rejects transactions that violate the policy.</w:t>
       </w:r>
     </w:p>
     <w:p>
@@ -1310,7 +1310,7 @@
         <w:pStyle w:val="ListBullet"/>
       </w:pPr>
       <w:r>
-        <w:t>Riwayat transaksi dapat diverifikasi melalui contract event dan explorer.</w:t>
+        <w:t>Transaction history can be verified through contract events and the explorer.</w:t>
       </w:r>
     </w:p>
     <w:p>
@@ -1318,7 +1318,7 @@
         <w:pStyle w:val="Heading2"/>
       </w:pPr>
       <w:r>
-        <w:t>Alur Utama</w:t>
+        <w:t>Main Flow</w:t>
       </w:r>
     </w:p>
     <w:p>
@@ -1327,7 +1327,7 @@
         <w:ind w:left="374" w:hanging="374"/>
       </w:pPr>
       <w:r>
-        <w:t>1.  Pengguna membuka live website dan memilih jaringan BOT Chain.</w:t>
+        <w:t>1.  The user opens the live website and selects the BOT Chain network.</w:t>
       </w:r>
     </w:p>
     <w:p>
@@ -1336,7 +1336,7 @@
         <w:ind w:left="374" w:hanging="374"/>
       </w:pPr>
       <w:r>
-        <w:t>2.  Pengguna menghubungkan MetaMask dan membaca policy wallet.</w:t>
+        <w:t>2.  The user connects MetaMask and reads the wallet's policy.</w:t>
       </w:r>
     </w:p>
     <w:p>
@@ -1345,7 +1345,7 @@
         <w:ind w:left="374" w:hanging="374"/>
       </w:pPr>
       <w:r>
-        <w:t>3.  Pengguna memasukkan instruksi seperti Kirim 0.01 BOT ke 0x123 untuk desain logo.</w:t>
+        <w:t>3.  The user enters an instruction such as: Send 0.01 BOT to 0x123 for logo design.</w:t>
       </w:r>
     </w:p>
     <w:p>
@@ -1354,7 +1354,7 @@
         <w:ind w:left="374" w:hanging="374"/>
       </w:pPr>
       <w:r>
-        <w:t>4.  Backend menghasilkan intent terstruktur dan melakukan validasi awal.</w:t>
+        <w:t>4.  The backend produces a structured intent and performs initial validation.</w:t>
       </w:r>
     </w:p>
     <w:p>
@@ -1363,7 +1363,7 @@
         <w:ind w:left="374" w:hanging="374"/>
       </w:pPr>
       <w:r>
-        <w:t>5.  Frontend menampilkan penerima, nominal, tujuan, estimasi gas, serta hasil simulasi.</w:t>
+        <w:t>5.  The frontend displays the recipient, amount, purpose, estimated gas, and simulation result.</w:t>
       </w:r>
     </w:p>
     <w:p>
@@ -1372,7 +1372,7 @@
         <w:ind w:left="374" w:hanging="374"/>
       </w:pPr>
       <w:r>
-        <w:t>6.  Pengguna menekan konfirmasi dan menandatangani transaksi di MetaMask.</w:t>
+        <w:t>6.  The user confirms and signs the transaction in MetaMask.</w:t>
       </w:r>
     </w:p>
     <w:p>
@@ -1381,7 +1381,7 @@
         <w:ind w:left="374" w:hanging="374"/>
       </w:pPr>
       <w:r>
-        <w:t>7.  Smart contract memeriksa policy, mengeksekusi atau menolak transaksi, lalu menerbitkan event.</w:t>
+        <w:t>7.  The smart contract checks the policy, executes or rejects the transaction, and emits an event.</w:t>
       </w:r>
     </w:p>
     <w:p>
@@ -1390,7 +1390,7 @@
         <w:ind w:left="374" w:hanging="374"/>
       </w:pPr>
       <w:r>
-        <w:t>8.  Frontend menampilkan transaction hash dan tautan explorer.</w:t>
+        <w:t>8.  The frontend displays the transaction hash and explorer link.</w:t>
       </w:r>
     </w:p>
     <w:p>
@@ -1398,7 +1398,7 @@
         <w:pStyle w:val="Heading2"/>
       </w:pPr>
       <w:r>
-        <w:t>Batas MVP</w:t>
+        <w:t>MVP Scope</w:t>
       </w:r>
     </w:p>
     <w:tbl>
@@ -1447,7 +1447,7 @@
                 <w:color w:val="FFFFFF"/>
                 <w:sz w:val="18"/>
               </w:rPr>
-              <w:t>Termasuk</w:t>
+              <w:t>Included</w:t>
             </w:r>
           </w:p>
         </w:tc>
@@ -1473,7 +1473,7 @@
                 <w:color w:val="FFFFFF"/>
                 <w:sz w:val="18"/>
               </w:rPr>
-              <w:t>Belum Termasuk</w:t>
+              <w:t>Not included</w:t>
             </w:r>
           </w:p>
         </w:tc>
@@ -1501,7 +1501,7 @@
               <w:rPr>
                 <w:sz w:val="18"/>
               </w:rPr>
-              <w:t>Pembayaran native BOT</w:t>
+              <w:t>Native BOT payment</w:t>
             </w:r>
           </w:p>
         </w:tc>
@@ -1524,7 +1524,7 @@
               <w:rPr>
                 <w:sz w:val="18"/>
               </w:rPr>
-              <w:t>ERC 20 multi token</w:t>
+              <w:t>ERC-20 multi-token support</w:t>
             </w:r>
           </w:p>
         </w:tc>
@@ -1553,7 +1553,7 @@
               <w:rPr>
                 <w:sz w:val="18"/>
               </w:rPr>
-              <w:t>Batas per transaksi dan harian</w:t>
+              <w:t>Transaction and daily limits</w:t>
             </w:r>
           </w:p>
         </w:tc>
@@ -1606,7 +1606,7 @@
                 <w:sz w:val="18"/>
               </w:rPr>
               <w:lastRenderedPageBreak/>
-              <w:t>Allowed recipient dan pause</w:t>
+              <w:t>Recipient allowlist and pause control</w:t>
             </w:r>
           </w:p>
         </w:tc>
@@ -1629,7 +1629,7 @@
               <w:rPr>
                 <w:sz w:val="18"/>
               </w:rPr>
-              <w:t>Multi signature organisasi</w:t>
+              <w:t>Organizational multisignature</w:t>
             </w:r>
           </w:p>
         </w:tc>
@@ -1658,7 +1658,7 @@
               <w:rPr>
                 <w:sz w:val="18"/>
               </w:rPr>
-              <w:t>Intent parsing dan preview</w:t>
+              <w:t>Intent parsing and preview</w:t>
             </w:r>
           </w:p>
         </w:tc>
@@ -1682,7 +1682,7 @@
               <w:rPr>
                 <w:sz w:val="18"/>
               </w:rPr>
-              <w:t>Agent otomatis tanpa persetujuan manusia</w:t>
+              <w:t>Automated agents without human approval</w:t>
             </w:r>
           </w:p>
         </w:tc>
@@ -1710,7 +1710,7 @@
               <w:rPr>
                 <w:sz w:val="18"/>
               </w:rPr>
-              <w:t>Testnet dan mainnet</w:t>
+              <w:t>Testnet and mainnet</w:t>
             </w:r>
           </w:p>
         </w:tc>
@@ -1733,7 +1733,7 @@
               <w:rPr>
                 <w:sz w:val="18"/>
               </w:rPr>
-              <w:t>Mobile application</w:t>
+              <w:t>The mobile application</w:t>
             </w:r>
           </w:p>
         </w:tc>
@@ -1762,7 +1762,7 @@
               <w:rPr>
                 <w:sz w:val="18"/>
               </w:rPr>
-              <w:t>Event audit on chain</w:t>
+              <w:t>Event audit on-chain</w:t>
             </w:r>
           </w:p>
         </w:tc>
@@ -1786,7 +1786,7 @@
               <w:rPr>
                 <w:sz w:val="18"/>
               </w:rPr>
-              <w:t>Dashboard analitik besar</w:t>
+              <w:t>Large analytics dashboard</w:t>
             </w:r>
           </w:p>
         </w:tc>
@@ -1802,7 +1802,7 @@
         <w:pStyle w:val="Heading2"/>
       </w:pPr>
       <w:r>
-        <w:t>Kriteria Selesai</w:t>
+        <w:t>Definition of Done</w:t>
       </w:r>
     </w:p>
     <w:p>
@@ -1810,7 +1810,7 @@
         <w:pStyle w:val="Checklist"/>
       </w:pPr>
       <w:r>
-        <w:t>[ ] Contract terverifikasi dan memiliki aktivitas on chain.</w:t>
+        <w:t>[ ] The smart contract is verified and has on-chain activity.</w:t>
       </w:r>
     </w:p>
     <w:p>
@@ -1818,7 +1818,7 @@
         <w:pStyle w:val="Checklist"/>
       </w:pPr>
       <w:r>
-        <w:t>[ ] Main action berhasil minimal tiga kali berturut turut dari browser bersih.</w:t>
+        <w:t>[ ] The main action succeeds at least three consecutive times in a clean browser.</w:t>
       </w:r>
     </w:p>
     <w:p>
@@ -1826,7 +1826,7 @@
         <w:pStyle w:val="Checklist"/>
       </w:pPr>
       <w:r>
-        <w:t>[ ] Kasus nominal melebihi limit menghasilkan revert yang dipahami pengguna.</w:t>
+        <w:t>[ ] An amount above the limit produces a revert message the user can understand.</w:t>
       </w:r>
     </w:p>
     <w:p>
@@ -1834,7 +1834,7 @@
         <w:pStyle w:val="Checklist"/>
       </w:pPr>
       <w:r>
-        <w:t>[ ] Tidak ada private key, seed phrase, atau API key di repository dan browser bundle.</w:t>
+        <w:t>[ ] No private keys, seed phrases, or API keys appear in the repository or browser bundle.</w:t>
       </w:r>
     </w:p>
     <w:p>
@@ -1842,7 +1842,7 @@
         <w:pStyle w:val="Checklist"/>
       </w:pPr>
       <w:r>
-        <w:t>[ ] Website, API, RPC, dan explorer dapat diakses selama periode penilaian.</w:t>
+        <w:t>[ ] The website, API, RPC, and explorer remain accessible throughout the judging period.</w:t>
       </w:r>
     </w:p>
     <w:p>
@@ -1850,7 +1850,7 @@
         <w:pStyle w:val="Heading1"/>
       </w:pPr>
       <w:r>
-        <w:t>3 Arsitektur Sistem</w:t>
+        <w:t>3 System architecture</w:t>
       </w:r>
     </w:p>
     <w:p>
@@ -1858,7 +1858,7 @@
         <w:pStyle w:val="BodyText"/>
       </w:pPr>
       <w:r>
-        <w:t>BOT Chain menyimpan policy, penggunaan harian, saldo vault, dan event pembayaran. SQLite hanya menyimpan data operasional seperti session anonim, latency, hasil error yang telah dibersihkan, dan rate limit. Data di SQLite tidak boleh menggantikan state kontrak.</w:t>
+        <w:t>BOT Chain stores policies, daily usage, vault balances, and payment events. SQLite stores only operational data such as anonymous sessions, latency, sanitized error results, and rate-limit data. SQLite data must never replace on-chain contract state.</w:t>
       </w:r>
     </w:p>
     <w:p>
@@ -1866,7 +1866,7 @@
         <w:pStyle w:val="Heading2"/>
       </w:pPr>
       <w:r>
-        <w:t>Komponen dan Tanggung Jawab</w:t>
+        <w:t>Components and Responsibilities</w:t>
       </w:r>
     </w:p>
     <w:tbl>
@@ -1916,7 +1916,7 @@
                 <w:color w:val="FFFFFF"/>
                 <w:sz w:val="18"/>
               </w:rPr>
-              <w:t>Lapisan</w:t>
+              <w:t>Layer</w:t>
             </w:r>
           </w:p>
         </w:tc>
@@ -1942,7 +1942,7 @@
                 <w:color w:val="FFFFFF"/>
                 <w:sz w:val="18"/>
               </w:rPr>
-              <w:t>Komponen</w:t>
+              <w:t>Component</w:t>
             </w:r>
           </w:p>
         </w:tc>
@@ -1968,7 +1968,7 @@
                 <w:color w:val="FFFFFF"/>
                 <w:sz w:val="18"/>
               </w:rPr>
-              <w:t>Tanggung Jawab</w:t>
+              <w:t>Responsibilities</w:t>
             </w:r>
           </w:p>
         </w:tc>
@@ -1996,7 +1996,7 @@
               <w:rPr>
                 <w:sz w:val="17"/>
               </w:rPr>
-              <w:t>Pengguna</w:t>
+              <w:t>User</w:t>
             </w:r>
           </w:p>
         </w:tc>
@@ -2019,7 +2019,7 @@
               <w:rPr>
                 <w:sz w:val="17"/>
               </w:rPr>
-              <w:t>Browser dan MetaMask</w:t>
+              <w:t>Browser and MetaMask</w:t>
             </w:r>
           </w:p>
         </w:tc>
@@ -2042,7 +2042,7 @@
               <w:rPr>
                 <w:sz w:val="17"/>
               </w:rPr>
-              <w:t>Wallet connection, network switching, approval, dan signature</w:t>
+              <w:t>Wallet connection, network switching, approval, and signature</w:t>
             </w:r>
           </w:p>
         </w:tc>
@@ -2095,7 +2095,7 @@
               <w:rPr>
                 <w:sz w:val="17"/>
               </w:rPr>
-              <w:t>React Vite dan ethers.js atau viem</w:t>
+              <w:t>React Vite and ethers.js or viem</w:t>
             </w:r>
           </w:p>
         </w:tc>
@@ -2119,7 +2119,7 @@
               <w:rPr>
                 <w:sz w:val="17"/>
               </w:rPr>
-              <w:t>Form intent, preview, simulasi, status transaksi, dan explorer link</w:t>
+              <w:t>Form intent, preview, simulation, status of the transaction, and explorer link</w:t>
             </w:r>
           </w:p>
         </w:tc>
@@ -2193,7 +2193,7 @@
               <w:rPr>
                 <w:sz w:val="17"/>
               </w:rPr>
-              <w:t>Session, intent parsing, validasi, observability, dan rate limiting</w:t>
+              <w:t>Session, intent parsing, validation, observability, and rate limiting</w:t>
             </w:r>
           </w:p>
         </w:tc>
@@ -2246,7 +2246,7 @@
               <w:rPr>
                 <w:sz w:val="17"/>
               </w:rPr>
-              <w:t>Ollama ARM64</w:t>
+              <w:t>The Ollama ARM64</w:t>
             </w:r>
           </w:p>
         </w:tc>
@@ -2270,7 +2270,7 @@
               <w:rPr>
                 <w:sz w:val="17"/>
               </w:rPr>
-              <w:t>Mengubah bahasa natural menjadi JSON tanpa menandatangani transaksi</w:t>
+              <w:t>Convert natural language to JSON without signing a transaction</w:t>
             </w:r>
           </w:p>
         </w:tc>
@@ -2344,7 +2344,7 @@
               <w:rPr>
                 <w:sz w:val="17"/>
               </w:rPr>
-              <w:t>Audit operasional non sensitif dan session sementara</w:t>
+              <w:t>Non-sensitive operational audits and temporary sessions</w:t>
             </w:r>
           </w:p>
         </w:tc>
@@ -2397,7 +2397,7 @@
               <w:rPr>
                 <w:sz w:val="17"/>
               </w:rPr>
-              <w:t>AgentGuard.sol pada BOT Chain</w:t>
+              <w:t>AgentGuard.sol on BOT Chain</w:t>
             </w:r>
           </w:p>
         </w:tc>
@@ -2421,7 +2421,7 @@
               <w:rPr>
                 <w:sz w:val="17"/>
               </w:rPr>
-              <w:t>Policy enforcement, custody terbatas, settlement, dan event</w:t>
+              <w:t>Policy enforcement, limited custody, settlement, and events</w:t>
             </w:r>
           </w:p>
         </w:tc>
@@ -2472,7 +2472,7 @@
               <w:rPr>
                 <w:sz w:val="17"/>
               </w:rPr>
-              <w:t>Oracle Cloud dan Caddy</w:t>
+              <w:t>Oracle Cloud and Caddy</w:t>
             </w:r>
           </w:p>
         </w:tc>
@@ -2495,7 +2495,7 @@
               <w:rPr>
                 <w:sz w:val="17"/>
               </w:rPr>
-              <w:t>TLS, reverse proxy, process supervision, backup, dan health check</w:t>
+              <w:t>TLS, reverse proxy, process supervision, backup, and health check</w:t>
             </w:r>
           </w:p>
         </w:tc>
@@ -2511,7 +2511,7 @@
         <w:pStyle w:val="Heading2"/>
       </w:pPr>
       <w:r>
-        <w:t>Aliran Data Pembayaran</w:t>
+        <w:t>Payment Data Flow</w:t>
       </w:r>
     </w:p>
     <w:p>
@@ -2524,7 +2524,7 @@
           <w:color w:val="263238"/>
           <w:sz w:val="18"/>
         </w:rPr>
-        <w:t>Pengguna</w:t>
+        <w:t>User</w:t>
       </w:r>
     </w:p>
     <w:p>
@@ -2537,7 +2537,7 @@
           <w:color w:val="263238"/>
           <w:sz w:val="18"/>
         </w:rPr>
-        <w:t xml:space="preserve">  -&gt; Frontend mengirim instruksi ke API</w:t>
+        <w:t xml:space="preserve">  -&gt; Frontend sends instructions to the API</w:t>
       </w:r>
     </w:p>
     <w:p>
@@ -2550,7 +2550,7 @@
           <w:color w:val="263238"/>
           <w:sz w:val="18"/>
         </w:rPr>
-        <w:t xml:space="preserve">  -&gt; AI menghasilkan intent JSON</w:t>
+        <w:t xml:space="preserve">  -&gt; AI generates a JSON intent</w:t>
       </w:r>
     </w:p>
     <w:p>
@@ -2563,7 +2563,7 @@
           <w:color w:val="263238"/>
           <w:sz w:val="18"/>
         </w:rPr>
-        <w:t xml:space="preserve">  -&gt; Backend memvalidasi alamat nominal dan network</w:t>
+        <w:t xml:space="preserve">  -&gt; Backend validates the address, amount, and network</w:t>
       </w:r>
     </w:p>
     <w:p>
@@ -2576,7 +2576,7 @@
           <w:color w:val="263238"/>
           <w:sz w:val="18"/>
         </w:rPr>
-        <w:t xml:space="preserve">  -&gt; Frontend membaca policy dan melakukan simulasi</w:t>
+        <w:t xml:space="preserve">  -&gt; Frontend reads policy and performs simulation</w:t>
       </w:r>
     </w:p>
     <w:p>
@@ -2589,7 +2589,7 @@
           <w:color w:val="263238"/>
           <w:sz w:val="18"/>
         </w:rPr>
-        <w:t xml:space="preserve">  -&gt; Pengguna menyetujui melalui MetaMask</w:t>
+        <w:t xml:space="preserve">  -&gt; User approves through MetaMask</w:t>
       </w:r>
     </w:p>
     <w:p>
@@ -2603,7 +2603,7 @@
           <w:sz w:val="18"/>
         </w:rPr>
         <w:lastRenderedPageBreak/>
-        <w:t xml:space="preserve">  -&gt; Smart contract menegakkan policy</w:t>
+        <w:t xml:space="preserve">  -&gt; Smart contract enforces the policy</w:t>
       </w:r>
     </w:p>
     <w:p>
@@ -2616,7 +2616,7 @@
           <w:color w:val="263238"/>
           <w:sz w:val="18"/>
         </w:rPr>
-        <w:t xml:space="preserve">  -&gt; BOT Chain menyimpan transaksi dan event</w:t>
+        <w:t xml:space="preserve">  -&gt; BOT Chain records the transaction and event</w:t>
       </w:r>
     </w:p>
     <w:p>
@@ -2629,7 +2629,7 @@
           <w:color w:val="263238"/>
           <w:sz w:val="18"/>
         </w:rPr>
-        <w:t xml:space="preserve">  -&gt; Frontend menampilkan status dan explorer link</w:t>
+        <w:t xml:space="preserve">  -&gt; Frontend displays status and explorer links</w:t>
       </w:r>
     </w:p>
     <w:p>
@@ -2637,7 +2637,7 @@
         <w:pStyle w:val="Heading2"/>
       </w:pPr>
       <w:r>
-        <w:t>Batas Kepercayaan</w:t>
+        <w:t>Trust Boundaries</w:t>
       </w:r>
     </w:p>
     <w:p>
@@ -2645,7 +2645,7 @@
         <w:pStyle w:val="ListBullet"/>
       </w:pPr>
       <w:r>
-        <w:t>Output model diperlakukan sebagai proposal data yang belum dipercaya.</w:t>
+        <w:t>Model output is treated as an untrusted data proposal.</w:t>
       </w:r>
     </w:p>
     <w:p>
@@ -2653,7 +2653,7 @@
         <w:pStyle w:val="ListBullet"/>
       </w:pPr>
       <w:r>
-        <w:t>Backend menolak alamat, nominal, chain ID, atau action yang tidak sesuai schema.</w:t>
+        <w:t>The backend rejects addresses, amounts, chain IDs, or actions that do not match the schema.</w:t>
       </w:r>
     </w:p>
     <w:p>
@@ -2661,7 +2661,7 @@
         <w:pStyle w:val="ListBullet"/>
       </w:pPr>
       <w:r>
-        <w:t>Frontend meminta pengguna memeriksa preview sebelum membuka MetaMask.</w:t>
+        <w:t>Frontend asks users to check the preview before opening MetaMask.</w:t>
       </w:r>
     </w:p>
     <w:p>
@@ -2669,7 +2669,7 @@
         <w:pStyle w:val="ListBullet"/>
       </w:pPr>
       <w:r>
-        <w:t>Smart contract tidak mempercayai hasil simulasi backend dan mengulangi seluruh pemeriksaan policy.</w:t>
+        <w:t>The smart contract does not trust backend simulation results and repeats every policy check.</w:t>
       </w:r>
     </w:p>
     <w:p>
@@ -2677,7 +2677,7 @@
         <w:pStyle w:val="ListBullet"/>
       </w:pPr>
       <w:r>
-        <w:t>Server tidak menerima seed phrase atau private key pengguna.</w:t>
+        <w:t>The server never accepts a user seed phrase or private key.</w:t>
       </w:r>
     </w:p>
     <w:p>
@@ -2687,7 +2687,7 @@
       </w:pPr>
       <w:r>
         <w:lastRenderedPageBreak/>
-        <w:t>4 Fase Preparation</w:t>
+        <w:t>4 Preparation Phase</w:t>
       </w:r>
     </w:p>
     <w:p>
@@ -2695,7 +2695,7 @@
         <w:pStyle w:val="BodyText"/>
       </w:pPr>
       <w:r>
-        <w:t>Fase preparation menghasilkan repository yang siap dikerjakan, akun dan wallet terpisah untuk development, VM cloud yang dapat diakses aman, serta keputusan scope yang tidak berubah selama build week kecuali ada blocker teknis.</w:t>
+        <w:t>The preparation phase produces a ready-to-use repository, separate development accounts and wallets, a securely accessible cloud VM, and scope decisions that remain fixed during Build Week unless a technical blocker arises.</w:t>
       </w:r>
     </w:p>
     <w:p>
@@ -2703,7 +2703,7 @@
         <w:pStyle w:val="Heading2"/>
       </w:pPr>
       <w:r>
-        <w:t>Persiapan Produk dan Tim</w:t>
+        <w:t>Product and Team Preparation</w:t>
       </w:r>
     </w:p>
     <w:p>
@@ -2711,7 +2711,7 @@
         <w:pStyle w:val="Checklist"/>
       </w:pPr>
       <w:r>
-        <w:t>[ ] Tetapkan nama AgentGuard, satu kalimat masalah, satu alur demo, dan target pengguna.</w:t>
+        <w:t>[ ] Define the AgentGuard name, one-sentence problem statement, one demo flow, and target user.</w:t>
       </w:r>
     </w:p>
     <w:p>
@@ -2719,7 +2719,7 @@
         <w:pStyle w:val="Checklist"/>
       </w:pPr>
       <w:r>
-        <w:t>[ ] Tentukan pembagian peran contract, backend, frontend, deployment, dokumentasi, dan demo.</w:t>
+        <w:t>[ ] Assign roles for the smart contract, backend, frontend, deployment, documentation, and demo.</w:t>
       </w:r>
     </w:p>
     <w:p>
@@ -2727,7 +2727,7 @@
         <w:pStyle w:val="Checklist"/>
       </w:pPr>
       <w:r>
-        <w:t>[ ] Buat definition of done untuk setiap workstream.</w:t>
+        <w:t>[ ] Make a definition of done for each workstream.</w:t>
       </w:r>
     </w:p>
     <w:p>
@@ -2735,7 +2735,7 @@
         <w:pStyle w:val="Checklist"/>
       </w:pPr>
       <w:r>
-        <w:t>[ ] Buat project board dengan prioritas Must Should Could.</w:t>
+        <w:t>[ ] Create a project board with a Must Should Could priority.</w:t>
       </w:r>
     </w:p>
     <w:p>
@@ -2743,7 +2743,7 @@
         <w:pStyle w:val="Checklist"/>
       </w:pPr>
       <w:r>
-        <w:t>[ ] Bekukan fitur non MVP sampai testnet end to end lulus.</w:t>
+        <w:t>[ ] Freeze non-MVP features until the end-to-end testnet flow passes.</w:t>
       </w:r>
     </w:p>
     <w:p>
@@ -2751,7 +2751,7 @@
         <w:pStyle w:val="Heading2"/>
       </w:pPr>
       <w:r>
-        <w:t>Persiapan Repository</w:t>
+        <w:t>Repository Preparation</w:t>
       </w:r>
     </w:p>
     <w:p>
@@ -2993,7 +2993,7 @@
         <w:pStyle w:val="ListBullet"/>
       </w:pPr>
       <w:r>
-        <w:t>Buat branch integrasi terpisah dan lindungi branch utama dari perubahan langsung.</w:t>
+        <w:t>Create a separate integration branch and protect the main branch from direct changes.</w:t>
       </w:r>
     </w:p>
     <w:p>
@@ -3001,7 +3001,7 @@
         <w:pStyle w:val="ListBullet"/>
       </w:pPr>
       <w:r>
-        <w:t>Tambahkan .env.example tanpa secret.</w:t>
+        <w:t>Add .env.example without secrets.</w:t>
       </w:r>
     </w:p>
     <w:p>
@@ -3009,7 +3009,7 @@
         <w:pStyle w:val="ListBullet"/>
       </w:pPr>
       <w:r>
-        <w:t>Pisahkan requirements server ARM dari dependency development laptop bila perlu.</w:t>
+        <w:t>Separate ARM server requirements from laptop development dependencies when necessary.</w:t>
       </w:r>
     </w:p>
     <w:p>
@@ -3017,7 +3017,7 @@
         <w:pStyle w:val="ListBullet"/>
       </w:pPr>
       <w:r>
-        <w:t>Pastikan workflow build mendukung linux arm64.</w:t>
+        <w:t>Ensure the build workflow supports Linux ARM64.</w:t>
       </w:r>
     </w:p>
     <w:p>
@@ -3025,7 +3025,7 @@
         <w:pStyle w:val="Heading2"/>
       </w:pPr>
       <w:r>
-        <w:t>Persiapan Wallet dan BOT Chain</w:t>
+        <w:t>Wallet and BOT Chain Preparation</w:t>
       </w:r>
     </w:p>
     <w:p>
@@ -3033,7 +3033,7 @@
         <w:pStyle w:val="Checklist"/>
       </w:pPr>
       <w:r>
-        <w:t>[ ] Buat wallet development terpisah dari wallet pribadi.</w:t>
+        <w:t>[ ] Create a development wallet separate from personal wallets.</w:t>
       </w:r>
     </w:p>
     <w:p>
@@ -3041,7 +3041,7 @@
         <w:pStyle w:val="Checklist"/>
       </w:pPr>
       <w:r>
-        <w:t>[ ] Tambahkan BOT Chain testnet Chain ID 968 dan RPC https://rpc.bohr.life.</w:t>
+        <w:t>[ ] Add BOT Chain testnet Chain ID 968 and RPC https://rpc.bohr.life.</w:t>
       </w:r>
     </w:p>
     <w:p>
@@ -3049,7 +3049,7 @@
         <w:pStyle w:val="Checklist"/>
       </w:pPr>
       <w:r>
-        <w:t>[ ] Ambil test BOT dari faucet resmi dan simpan alamat wallet development.</w:t>
+        <w:t>[ ] Obtain test BOT from the official faucet and record the development wallet address.</w:t>
       </w:r>
     </w:p>
     <w:p>
@@ -3057,7 +3057,7 @@
         <w:pStyle w:val="Checklist"/>
       </w:pPr>
       <w:r>
-        <w:t>[ ] Rencanakan wallet deployment mainnet dan minta alokasi gas kepada organizer.</w:t>
+        <w:t>[ ] Plan the mainnet deployment wallet and request a gas allocation from the organizer.</w:t>
       </w:r>
     </w:p>
     <w:p>
@@ -3065,7 +3065,7 @@
         <w:pStyle w:val="Checklist"/>
       </w:pPr>
       <w:r>
-        <w:t>[ ] Jangan menyimpan recovery phrase secara digital atau di repository.</w:t>
+        <w:t>[ ] Do not store recovery phrases digitally or in a repository.</w:t>
       </w:r>
     </w:p>
     <w:p>
@@ -3075,7 +3075,7 @@
       </w:pPr>
       <w:r>
         <w:lastRenderedPageBreak/>
-        <w:t>Persiapan Oracle Cloud</w:t>
+        <w:t>Oracle Cloud Preparation</w:t>
       </w:r>
     </w:p>
     <w:tbl>
@@ -3150,7 +3150,7 @@
                 <w:color w:val="FFFFFF"/>
                 <w:sz w:val="18"/>
               </w:rPr>
-              <w:t>Nilai Rencana</w:t>
+              <w:t>Planned Value</w:t>
             </w:r>
           </w:p>
         </w:tc>
@@ -3254,7 +3254,7 @@
               <w:rPr>
                 <w:sz w:val="18"/>
               </w:rPr>
-              <w:t>4 OCPU dan 24 GB RAM selama lomba</w:t>
+              <w:t>4 OCPUs and 24 GB RAM during the hackathon</w:t>
             </w:r>
           </w:p>
         </w:tc>
@@ -3282,7 +3282,7 @@
               <w:rPr>
                 <w:sz w:val="18"/>
               </w:rPr>
-              <w:t>OS</w:t>
+              <w:t>The OS</w:t>
             </w:r>
           </w:p>
         </w:tc>
@@ -3358,7 +3358,7 @@
               <w:rPr>
                 <w:sz w:val="18"/>
               </w:rPr>
-              <w:t>100 GB</w:t>
+              <w:t>100 GB of data</w:t>
             </w:r>
           </w:p>
         </w:tc>
@@ -3409,7 +3409,7 @@
               <w:rPr>
                 <w:sz w:val="18"/>
               </w:rPr>
-              <w:t>8 GB sebagai proteksi OOM</w:t>
+              <w:t>8 GB as OOM protection</w:t>
             </w:r>
           </w:p>
         </w:tc>
@@ -3438,7 +3438,7 @@
               <w:rPr>
                 <w:sz w:val="18"/>
               </w:rPr>
-              <w:t>Port publik</w:t>
+              <w:t>Public ports</w:t>
             </w:r>
           </w:p>
         </w:tc>
@@ -3462,7 +3462,7 @@
               <w:rPr>
                 <w:sz w:val="18"/>
               </w:rPr>
-              <w:t>80 dan 443</w:t>
+              <w:t>80 and 443</w:t>
             </w:r>
           </w:p>
         </w:tc>
@@ -3513,7 +3513,7 @@
               <w:rPr>
                 <w:sz w:val="18"/>
               </w:rPr>
-              <w:t>Port 22 dibatasi ke IP administrator</w:t>
+              <w:t>Port 22 restricted to the administrator IP</w:t>
             </w:r>
           </w:p>
         </w:tc>
@@ -3542,7 +3542,7 @@
               <w:rPr>
                 <w:sz w:val="18"/>
               </w:rPr>
-              <w:t>Resize setelah lomba</w:t>
+              <w:t>Post-hackathon resize</w:t>
             </w:r>
           </w:p>
         </w:tc>
@@ -3566,7 +3566,7 @@
               <w:rPr>
                 <w:sz w:val="18"/>
               </w:rPr>
-              <w:t>2 OCPU dan 12 GB sebelum trial berakhir</w:t>
+              <w:t>2 OCPUs and 12 GB before the trial expires</w:t>
             </w:r>
           </w:p>
         </w:tc>
@@ -3582,7 +3582,7 @@
         <w:pStyle w:val="Heading1"/>
       </w:pPr>
       <w:r>
-        <w:t>5 Fase Development</w:t>
+        <w:t>5 Development Phase</w:t>
       </w:r>
     </w:p>
     <w:p>
@@ -3590,7 +3590,7 @@
         <w:pStyle w:val="BodyText"/>
       </w:pPr>
       <w:r>
-        <w:t>Development dilakukan berurutan dari contract, backend intent parser, frontend wallet, lalu integrasi. Setiap workstream harus menghasilkan unit yang dapat diuji sebelum digabungkan.</w:t>
+        <w:t>Development proceeds in order from the smart contract to the backend intent parser, frontend wallet, and integration. Each workstream must produce a testable unit before integration.</w:t>
       </w:r>
     </w:p>
     <w:p>
@@ -3598,7 +3598,7 @@
         <w:pStyle w:val="Heading2"/>
       </w:pPr>
       <w:r>
-        <w:t>Workstream Smart Contract</w:t>
+        <w:t>Smart Contract Workstream</w:t>
       </w:r>
     </w:p>
     <w:p>
@@ -3606,7 +3606,7 @@
         <w:pStyle w:val="BodyText"/>
       </w:pPr>
       <w:r>
-        <w:t>Contract menjadi sumber kebenaran untuk policy dan pembayaran. Implementasi awal sebaiknya kecil, mudah dijelaskan, dan tidak bergantung pada library yang tidak diperlukan.</w:t>
+        <w:t>The smart contract is the source of truth for policies and payments. The initial implementation should be small, easy to explain, and free of unnecessary library dependencies.</w:t>
       </w:r>
     </w:p>
     <w:tbl>
@@ -3656,7 +3656,7 @@
                 <w:color w:val="FFFFFF"/>
                 <w:sz w:val="18"/>
               </w:rPr>
-              <w:t>Fungsi</w:t>
+              <w:t>Function</w:t>
             </w:r>
           </w:p>
         </w:tc>
@@ -3682,7 +3682,7 @@
                 <w:color w:val="FFFFFF"/>
                 <w:sz w:val="18"/>
               </w:rPr>
-              <w:t>Tujuan</w:t>
+              <w:t>Purpose</w:t>
             </w:r>
           </w:p>
         </w:tc>
@@ -3708,7 +3708,7 @@
                 <w:color w:val="FFFFFF"/>
                 <w:sz w:val="18"/>
               </w:rPr>
-              <w:t>Pemeriksaan Utama</w:t>
+              <w:t>Primary Checks</w:t>
             </w:r>
           </w:p>
         </w:tc>
@@ -3759,7 +3759,7 @@
               <w:rPr>
                 <w:sz w:val="17"/>
               </w:rPr>
-              <w:t>Menetapkan limit dan masa berlaku</w:t>
+              <w:t>Set limits and expiration time</w:t>
             </w:r>
           </w:p>
         </w:tc>
@@ -3782,7 +3782,7 @@
               <w:rPr>
                 <w:sz w:val="17"/>
               </w:rPr>
-              <w:t>Hanya pemilik policy dan nilai valid</w:t>
+              <w:t>Policy owner only; values must be valid</w:t>
             </w:r>
           </w:p>
         </w:tc>
@@ -3835,7 +3835,7 @@
               <w:rPr>
                 <w:sz w:val="17"/>
               </w:rPr>
-              <w:t>Mengelola penerima yang diizinkan</w:t>
+              <w:t>Manage allowlisted recipients</w:t>
             </w:r>
           </w:p>
         </w:tc>
@@ -3859,7 +3859,7 @@
               <w:rPr>
                 <w:sz w:val="17"/>
               </w:rPr>
-              <w:t>Alamat tidak nol dan otorisasi</w:t>
+              <w:t>Non-zero address and authorization</w:t>
             </w:r>
           </w:p>
         </w:tc>
@@ -3910,7 +3910,7 @@
               <w:rPr>
                 <w:sz w:val="17"/>
               </w:rPr>
-              <w:t>Mengisi saldo vault</w:t>
+              <w:t>Fund the vault balance</w:t>
             </w:r>
           </w:p>
         </w:tc>
@@ -3933,7 +3933,7 @@
               <w:rPr>
                 <w:sz w:val="17"/>
               </w:rPr>
-              <w:t>Nilai lebih dari nol</w:t>
+              <w:t>Value greater than zero</w:t>
             </w:r>
           </w:p>
         </w:tc>
@@ -3986,7 +3986,7 @@
               <w:rPr>
                 <w:sz w:val="17"/>
               </w:rPr>
-              <w:t>Mengirim BOT setelah policy lulus</w:t>
+              <w:t>Sending the BOT after the policy passes</w:t>
             </w:r>
           </w:p>
         </w:tc>
@@ -4010,7 +4010,7 @@
               <w:rPr>
                 <w:sz w:val="17"/>
               </w:rPr>
-              <w:t>Limit, daily usage, allowlist, expiry, pause, dan saldo</w:t>
+              <w:t>Limit, daily usage, allowlist, expiry, pause, and balance</w:t>
             </w:r>
           </w:p>
         </w:tc>
@@ -4061,7 +4061,7 @@
               <w:rPr>
                 <w:sz w:val="17"/>
               </w:rPr>
-              <w:t>Menghentikan pembayaran darurat</w:t>
+              <w:t>Stop payments in an emergency</w:t>
             </w:r>
           </w:p>
         </w:tc>
@@ -4084,7 +4084,7 @@
               <w:rPr>
                 <w:sz w:val="17"/>
               </w:rPr>
-              <w:t>Hanya pemilik</w:t>
+              <w:t>Owner only</w:t>
             </w:r>
           </w:p>
         </w:tc>
@@ -4137,7 +4137,7 @@
               <w:rPr>
                 <w:sz w:val="17"/>
               </w:rPr>
-              <w:t>Menarik saldo tersisa</w:t>
+              <w:t>Withdraw the remaining balance</w:t>
             </w:r>
           </w:p>
         </w:tc>
@@ -4161,7 +4161,7 @@
               <w:rPr>
                 <w:sz w:val="17"/>
               </w:rPr>
-              <w:t>Hanya pemilik dan reentrancy protection</w:t>
+              <w:t>Owner only; reentrancy protection</w:t>
             </w:r>
           </w:p>
         </w:tc>
@@ -4177,7 +4177,7 @@
         <w:pStyle w:val="ListBullet"/>
       </w:pPr>
       <w:r>
-        <w:t>Gunakan checks effects interactions dan custom errors agar revert mudah dipahami.</w:t>
+        <w:t>Use Checks-Effects-Interactions and custom errors so reverts are easy to understand.</w:t>
       </w:r>
     </w:p>
     <w:p>
@@ -4185,7 +4185,7 @@
         <w:pStyle w:val="ListBullet"/>
       </w:pPr>
       <w:r>
-        <w:t>Emit event untuk perubahan policy, deposit, pembayaran berhasil, pause, dan withdraw.</w:t>
+        <w:t>Emit events for policy changes, deposits, successful payments, pauses, and withdrawals.</w:t>
       </w:r>
     </w:p>
     <w:p>
@@ -4193,7 +4193,7 @@
         <w:pStyle w:val="ListBullet"/>
       </w:pPr>
       <w:r>
-        <w:t>Gunakan intentHash hanya untuk audit; jangan menyimpan prompt lengkap.</w:t>
+        <w:t>Use intentHash only for audits; do not keep a full prompt.</w:t>
       </w:r>
     </w:p>
     <w:p>
@@ -4201,7 +4201,7 @@
         <w:pStyle w:val="ListBullet"/>
       </w:pPr>
       <w:r>
-        <w:t>Tambahkan test untuk boundary nominal, reset periode harian, expiry, allowlist, pause, dan reentrancy.</w:t>
+        <w:t>Add tests for amount boundaries, daily-period resets, expiration, allowlists, pauses, and reentrancy.</w:t>
       </w:r>
     </w:p>
     <w:p>
@@ -4210,7 +4210,7 @@
       </w:pPr>
       <w:r>
         <w:lastRenderedPageBreak/>
-        <w:t>Workstream Backend dan AI</w:t>
+        <w:t>Backend and AI Workstream</w:t>
       </w:r>
     </w:p>
     <w:p>
@@ -4218,7 +4218,7 @@
         <w:pStyle w:val="BodyText"/>
       </w:pPr>
       <w:r>
-        <w:t>Backend menggunakan pola yang sudah ada pada ai-agent-workspace. Route BOTCHAIN_PIPELINE mengarahkan prompt pembayaran ke parser intent, lalu Pydantic memvalidasi keluaran model sebelum dikirim ke frontend.</w:t>
+        <w:t>The backend uses the existing ai-agent-workspace pattern. The BOTCHAIN_PIPELINE route sends payment prompts to the intent parser, then Pydantic validates the model output before returning it to the frontend.</w:t>
       </w:r>
     </w:p>
     <w:tbl>
@@ -4294,7 +4294,7 @@
                 <w:color w:val="FFFFFF"/>
                 <w:sz w:val="18"/>
               </w:rPr>
-              <w:t>Metode</w:t>
+              <w:t>Method</w:t>
             </w:r>
           </w:p>
         </w:tc>
@@ -4320,7 +4320,7 @@
                 <w:color w:val="FFFFFF"/>
                 <w:sz w:val="18"/>
               </w:rPr>
-              <w:t>Keluaran</w:t>
+              <w:t>Output</w:t>
             </w:r>
           </w:p>
         </w:tc>
@@ -4395,7 +4395,7 @@
               <w:rPr>
                 <w:sz w:val="17"/>
               </w:rPr>
-              <w:t>Intent tervalidasi atau error terstruktur</w:t>
+              <w:t>Validated intent or structured error</w:t>
             </w:r>
           </w:p>
         </w:tc>
@@ -4473,7 +4473,7 @@
               <w:rPr>
                 <w:sz w:val="17"/>
               </w:rPr>
-              <w:t>Hasil pemeriksaan read only terhadap policy</w:t>
+              <w:t>Read-only policy check result</w:t>
             </w:r>
           </w:p>
         </w:tc>
@@ -4548,7 +4548,7 @@
               <w:rPr>
                 <w:sz w:val="17"/>
               </w:rPr>
-              <w:t>Policy terbaru dari RPC</w:t>
+              <w:t>Latest policy from the RPC</w:t>
             </w:r>
           </w:p>
         </w:tc>
@@ -4626,7 +4626,7 @@
               <w:rPr>
                 <w:sz w:val="17"/>
               </w:rPr>
-              <w:t>Receipt dan status finalitas</w:t>
+              <w:t>Receipt and final status</w:t>
             </w:r>
           </w:p>
         </w:tc>
@@ -4701,7 +4701,7 @@
               <w:rPr>
                 <w:sz w:val="17"/>
               </w:rPr>
-              <w:t>Status API, model, database, dan RPC</w:t>
+              <w:t>API, model, database, and RPC status</w:t>
             </w:r>
           </w:p>
         </w:tc>
@@ -4717,7 +4717,7 @@
         <w:pStyle w:val="Heading3"/>
       </w:pPr>
       <w:r>
-        <w:t>Schema Intent</w:t>
+        <w:t>Intent Schema</w:t>
       </w:r>
     </w:p>
     <w:p>
@@ -4782,7 +4782,7 @@
           <w:color w:val="263238"/>
           <w:sz w:val="18"/>
         </w:rPr>
-        <w:t xml:space="preserve">  "purpose": "desain logo",</w:t>
+        <w:t xml:space="preserve">  "purpose": "logo design",</w:t>
       </w:r>
     </w:p>
     <w:p>
@@ -4816,7 +4816,7 @@
         <w:pStyle w:val="ListBullet"/>
       </w:pPr>
       <w:r>
-        <w:t>Batasi action ke daftar eksplisit dan tolak field tambahan.</w:t>
+        <w:t>Limit the action to the explicit list and reject additional fields.</w:t>
       </w:r>
     </w:p>
     <w:p>
@@ -4824,7 +4824,7 @@
         <w:pStyle w:val="ListBullet"/>
       </w:pPr>
       <w:r>
-        <w:t>Gunakan string desimal untuk nominal agar tidak terjadi floating point error.</w:t>
+        <w:t>Use a decimal string for the amount to avoid floating-point errors.</w:t>
       </w:r>
     </w:p>
     <w:p>
@@ -4832,7 +4832,7 @@
         <w:pStyle w:val="ListBullet"/>
       </w:pPr>
       <w:r>
-        <w:t>Normalisasi nominal menjadi wei hanya setelah validasi.</w:t>
+        <w:t>Convert the amount to wei only after validation.</w:t>
       </w:r>
     </w:p>
     <w:p>
@@ -4840,7 +4840,7 @@
         <w:pStyle w:val="ListBullet"/>
       </w:pPr>
       <w:r>
-        <w:t>Jika confidence rendah atau data kurang, minta pengguna memperbaiki instruksi.</w:t>
+        <w:t>If confidence is low or data is lacking, ask the user to correct the instructions.</w:t>
       </w:r>
     </w:p>
     <w:p>
@@ -4848,7 +4848,7 @@
         <w:pStyle w:val="ListBullet"/>
       </w:pPr>
       <w:r>
-        <w:t>Sediakan fallback form manual agar transaksi tidak bergantung pada ketersediaan model.</w:t>
+        <w:t>Provide a manual fallback form so that transactions do not depend on model availability.</w:t>
       </w:r>
     </w:p>
     <w:p>
@@ -4856,7 +4856,7 @@
         <w:pStyle w:val="Heading2"/>
       </w:pPr>
       <w:r>
-        <w:t>Workstream Frontend Web</w:t>
+        <w:t>Web Frontend Workstream</w:t>
       </w:r>
     </w:p>
     <w:p>
@@ -4864,7 +4864,7 @@
         <w:pStyle w:val="BodyText"/>
       </w:pPr>
       <w:r>
-        <w:t>Frontend web dibuat terpisah dari Electron agar dapat dipublikasikan dan diuji oleh juri. Komponen UI mengutamakan transparansi transaksi dan pemulihan error.</w:t>
+        <w:t>The web frontend is separate from Electron so it can be published and tested by the judges. UI components prioritize transaction transparency and error recovery.</w:t>
       </w:r>
     </w:p>
     <w:p>
@@ -4872,7 +4872,7 @@
         <w:pStyle w:val="ListBullet"/>
       </w:pPr>
       <w:r>
-        <w:t>Wallet connect dan network switch untuk testnet serta mainnet.</w:t>
+        <w:t>Wallet connect and network switch for testnet and mainnet.</w:t>
       </w:r>
     </w:p>
     <w:p>
@@ -4880,7 +4880,7 @@
         <w:pStyle w:val="ListBullet"/>
       </w:pPr>
       <w:r>
-        <w:t>Policy setup dengan batas per transaksi, batas harian, expiry, dan allowed recipient.</w:t>
+        <w:t>Policy setup with a per-transaction limit, daily limit, expiration, and allowed recipients.</w:t>
       </w:r>
     </w:p>
     <w:p>
@@ -4888,7 +4888,7 @@
         <w:pStyle w:val="ListBullet"/>
       </w:pPr>
       <w:r>
-        <w:t>Prompt input dengan contoh instruksi yang valid.</w:t>
+        <w:t>Prompt input with a valid instruction example.</w:t>
       </w:r>
     </w:p>
     <w:p>
@@ -4896,7 +4896,7 @@
         <w:pStyle w:val="ListBullet"/>
       </w:pPr>
       <w:r>
-        <w:t>Preview berisi alamat lengkap, nominal BOT, tujuan, chain, contract address, dan estimasi gas.</w:t>
+        <w:t>The preview contains the full address, BOT amount, purpose, chain, contract address, and estimated gas.</w:t>
       </w:r>
     </w:p>
     <w:p>
@@ -4904,7 +4904,7 @@
         <w:pStyle w:val="ListBullet"/>
       </w:pPr>
       <w:r>
-        <w:t>Status transaksi untuk awaiting signature, pending, confirmed, dan failed.</w:t>
+        <w:t>Transaction status for awaiting signature, pending, confirmed, and failed.</w:t>
       </w:r>
     </w:p>
     <w:p>
@@ -4912,7 +4912,7 @@
         <w:pStyle w:val="ListBullet"/>
       </w:pPr>
       <w:r>
-        <w:t>Tautan explorer yang dibentuk dari transaction hash.</w:t>
+        <w:t>The explorer link is constructed from the transaction hash.</w:t>
       </w:r>
     </w:p>
     <w:p>
@@ -4920,7 +4920,7 @@
         <w:pStyle w:val="ListBullet"/>
       </w:pPr>
       <w:r>
-        <w:t>Pesan error untuk model unavailable, RPC timeout, user rejection, wrong network, insufficient balance, dan contract revert.</w:t>
+        <w:t>Error messages for unavailable models, RPC timeout, user rejection, wrong network, insufficient balance, and contract revert.</w:t>
       </w:r>
     </w:p>
     <w:p>
@@ -4928,7 +4928,7 @@
         <w:pStyle w:val="Heading2"/>
       </w:pPr>
       <w:r>
-        <w:t>Integrasi dan Urutan Implementasi</w:t>
+        <w:t>Integration and Implementation Order</w:t>
       </w:r>
     </w:p>
     <w:p>
@@ -4937,7 +4937,7 @@
         <w:ind w:left="374" w:hanging="374"/>
       </w:pPr>
       <w:r>
-        <w:t>1.  Deploy contract awal pada testnet dan simpan ABI serta address.</w:t>
+        <w:t>1.  Deploy the initial smart contract on testnet and save its ABI and address.</w:t>
       </w:r>
     </w:p>
     <w:p>
@@ -4946,7 +4946,7 @@
         <w:ind w:left="374" w:hanging="374"/>
       </w:pPr>
       <w:r>
-        <w:t>2.  Hubungkan frontend ke wallet dan implementasikan read policy tanpa AI.</w:t>
+        <w:t>2.  Connect the frontend to the wallet and implement policy reads without AI.</w:t>
       </w:r>
     </w:p>
     <w:p>
@@ -4955,7 +4955,7 @@
         <w:ind w:left="374" w:hanging="374"/>
       </w:pPr>
       <w:r>
-        <w:t>3.  Implementasikan pembayaran manual sampai transaksi testnet berhasil.</w:t>
+        <w:t>3.  Implement manual payments until the testnet transaction is successful.</w:t>
       </w:r>
     </w:p>
     <w:p>
@@ -4964,7 +4964,7 @@
         <w:ind w:left="374" w:hanging="374"/>
       </w:pPr>
       <w:r>
-        <w:t>4.  Tambahkan endpoint parse intent dan validasi schema.</w:t>
+        <w:t>4.  Add the parse-intent endpoint and schema validation.</w:t>
       </w:r>
     </w:p>
     <w:p>
@@ -4974,7 +4974,7 @@
       </w:pPr>
       <w:r>
         <w:lastRenderedPageBreak/>
-        <w:t>5.  Hubungkan hasil parser ke preview tanpa mengirim transaksi otomatis.</w:t>
+        <w:t>5.  Connect the parser results to the preview without sending automated transactions.</w:t>
       </w:r>
     </w:p>
     <w:p>
@@ -4983,7 +4983,7 @@
         <w:ind w:left="374" w:hanging="374"/>
       </w:pPr>
       <w:r>
-        <w:t>6.  Tambahkan simulasi contract dan error mapping.</w:t>
+        <w:t>6.  Add contract simulation and error mapping.</w:t>
       </w:r>
     </w:p>
     <w:p>
@@ -4992,7 +4992,7 @@
         <w:ind w:left="374" w:hanging="374"/>
       </w:pPr>
       <w:r>
-        <w:t>7.  Jalankan end to end test dari browser baru.</w:t>
+        <w:t>7.  Run an end-to-end test from a clean browser.</w:t>
       </w:r>
     </w:p>
     <w:p>
@@ -5001,7 +5001,7 @@
         <w:ind w:left="374" w:hanging="374"/>
       </w:pPr>
       <w:r>
-        <w:t>8.  Bekukan contract setelah seluruh test kritis lulus.</w:t>
+        <w:t>8.  Freeze the smart contract after all critical tests pass.</w:t>
       </w:r>
     </w:p>
     <w:p>
@@ -5009,7 +5009,7 @@
         <w:pStyle w:val="Heading2"/>
       </w:pPr>
       <w:r>
-        <w:t>Konfigurasi Model pada A1</w:t>
+        <w:t>Model Configuration on A1</w:t>
       </w:r>
     </w:p>
     <w:p>
@@ -5121,7 +5121,7 @@
         <w:pStyle w:val="BodyText"/>
       </w:pPr>
       <w:r>
-        <w:t>Jika latency Qwen 9B tidak memenuhi target, gunakan model quantized 1B sampai 3B untuk intent parsing. Qwen 9B tetap tersedia untuk chat dan analisis yang tidak berada pada jalur pembayaran utama.</w:t>
+        <w:t>If Qwen 9B latency does not meet the target, use a quantized 1B to 3B model for intent parsing. Qwen 9B remains available for chat and analysis outside the main payment path.</w:t>
       </w:r>
     </w:p>
     <w:p>
@@ -5129,7 +5129,7 @@
         <w:pStyle w:val="Heading1"/>
       </w:pPr>
       <w:r>
-        <w:t>6 Fase Production</w:t>
+        <w:t>6 Production Phase</w:t>
       </w:r>
     </w:p>
     <w:p>
@@ -5137,7 +5137,7 @@
         <w:pStyle w:val="BodyText"/>
       </w:pPr>
       <w:r>
-        <w:t>Fase production mengubah build yang bekerja menjadi layanan yang aman dan dapat dipantau selama penilaian. Tim tidak menambahkan fitur baru setelah release candidate kecuali untuk memperbaiki blocker.</w:t>
+        <w:t>The production phase turns the working build into a secure, observable service for the judging period. The team adds no new features after the release candidate except to fix blockers.</w:t>
       </w:r>
     </w:p>
     <w:p>
@@ -5145,7 +5145,7 @@
         <w:pStyle w:val="Heading2"/>
       </w:pPr>
       <w:r>
-        <w:t>Keamanan Aplikasi</w:t>
+        <w:t>Application Security</w:t>
       </w:r>
     </w:p>
     <w:tbl>
@@ -5195,7 +5195,7 @@
                 <w:color w:val="FFFFFF"/>
                 <w:sz w:val="18"/>
               </w:rPr>
-              <w:t>Kontrol</w:t>
+              <w:t>Control</w:t>
             </w:r>
           </w:p>
         </w:tc>
@@ -5221,7 +5221,7 @@
                 <w:color w:val="FFFFFF"/>
                 <w:sz w:val="18"/>
               </w:rPr>
-              <w:t>Implementasi</w:t>
+              <w:t>Implementation</w:t>
             </w:r>
           </w:p>
         </w:tc>
@@ -5247,7 +5247,7 @@
                 <w:color w:val="FFFFFF"/>
                 <w:sz w:val="18"/>
               </w:rPr>
-              <w:t>Penerimaan</w:t>
+              <w:t>Acceptance</w:t>
             </w:r>
           </w:p>
         </w:tc>
@@ -5298,7 +5298,7 @@
               <w:rPr>
                 <w:sz w:val="16"/>
               </w:rPr>
-              <w:t>Environment file berizin ketat atau OCI Vault</w:t>
+              <w:t>Environment file with strict permissions or OCI Vault</w:t>
             </w:r>
           </w:p>
         </w:tc>
@@ -5321,7 +5321,7 @@
               <w:rPr>
                 <w:sz w:val="16"/>
               </w:rPr>
-              <w:t>Secret tidak muncul dalam git dan frontend bundle</w:t>
+              <w:t>Secrets do not appear in Git or the frontend bundle</w:t>
             </w:r>
           </w:p>
         </w:tc>
@@ -5350,7 +5350,7 @@
               <w:rPr>
                 <w:sz w:val="16"/>
               </w:rPr>
-              <w:t>CORS</w:t>
+              <w:t>The CORS</w:t>
             </w:r>
           </w:p>
         </w:tc>
@@ -5374,7 +5374,7 @@
               <w:rPr>
                 <w:sz w:val="16"/>
               </w:rPr>
-              <w:t>Hanya domain frontend</w:t>
+              <w:t>Only the frontend domain</w:t>
             </w:r>
           </w:p>
         </w:tc>
@@ -5398,7 +5398,7 @@
               <w:rPr>
                 <w:sz w:val="16"/>
               </w:rPr>
-              <w:t>Origin lain menerima penolakan</w:t>
+              <w:t>Other origins are rejected</w:t>
             </w:r>
           </w:p>
         </w:tc>
@@ -5449,7 +5449,7 @@
               <w:rPr>
                 <w:sz w:val="16"/>
               </w:rPr>
-              <w:t>Batas per IP dan session pada endpoint AI</w:t>
+              <w:t>Per-IP and per-session limits on AI endpoints</w:t>
             </w:r>
           </w:p>
         </w:tc>
@@ -5472,7 +5472,7 @@
               <w:rPr>
                 <w:sz w:val="16"/>
               </w:rPr>
-              <w:t>Burst berlebih menerima 429</w:t>
+              <w:t>Excessive bursts receive HTTP 429</w:t>
             </w:r>
           </w:p>
         </w:tc>
@@ -5525,7 +5525,7 @@
               <w:rPr>
                 <w:sz w:val="16"/>
               </w:rPr>
-              <w:t>Pydantic strict dan batas ukuran body</w:t>
+              <w:t>Pydantic strict and body size limits</w:t>
             </w:r>
           </w:p>
         </w:tc>
@@ -5549,7 +5549,7 @@
               <w:rPr>
                 <w:sz w:val="16"/>
               </w:rPr>
-              <w:t>Field tambahan serta nilai invalid ditolak</w:t>
+              <w:t>Additional fields as well as invalid values are rejected</w:t>
             </w:r>
           </w:p>
         </w:tc>
@@ -5600,7 +5600,7 @@
               <w:rPr>
                 <w:sz w:val="16"/>
               </w:rPr>
-              <w:t>Tidak ada private key pengguna pada backend</w:t>
+              <w:t>No user private keys on the backend</w:t>
             </w:r>
           </w:p>
         </w:tc>
@@ -5623,7 +5623,7 @@
               <w:rPr>
                 <w:sz w:val="16"/>
               </w:rPr>
-              <w:t>Audit repository dan environment lulus</w:t>
+              <w:t>Repository and environment audits pass</w:t>
             </w:r>
           </w:p>
         </w:tc>
@@ -5652,7 +5652,7 @@
               <w:rPr>
                 <w:sz w:val="16"/>
               </w:rPr>
-              <w:t>Contract safety</w:t>
+              <w:t>Smart Contract Security</w:t>
             </w:r>
           </w:p>
         </w:tc>
@@ -5676,7 +5676,7 @@
               <w:rPr>
                 <w:sz w:val="16"/>
               </w:rPr>
-              <w:t>Pause, reentrancy protection, checks effects interactions</w:t>
+              <w:t>Pause, reentrancy protection, Checks-Effects-Interactions</w:t>
             </w:r>
           </w:p>
         </w:tc>
@@ -5700,7 +5700,7 @@
               <w:rPr>
                 <w:sz w:val="16"/>
               </w:rPr>
-              <w:t>Test attack dan revert lulus</w:t>
+              <w:t>Attack and revert tests pass</w:t>
             </w:r>
           </w:p>
         </w:tc>
@@ -5751,7 +5751,7 @@
               <w:rPr>
                 <w:sz w:val="16"/>
               </w:rPr>
-              <w:t>TLS pada api subdomain</w:t>
+              <w:t>TLS on the API subdomain</w:t>
             </w:r>
           </w:p>
         </w:tc>
@@ -5774,7 +5774,7 @@
               <w:rPr>
                 <w:sz w:val="16"/>
               </w:rPr>
-              <w:t>Tidak ada endpoint produksi melalui HTTP biasa</w:t>
+              <w:t>No production endpoints served over plain HTTP</w:t>
             </w:r>
           </w:p>
         </w:tc>
@@ -5790,7 +5790,7 @@
         <w:pStyle w:val="Heading2"/>
       </w:pPr>
       <w:r>
-        <w:t>Reliability dan Observability</w:t>
+        <w:t>Reliability and Observability</w:t>
       </w:r>
     </w:p>
     <w:p>
@@ -5798,7 +5798,7 @@
         <w:pStyle w:val="ListBullet"/>
       </w:pPr>
       <w:r>
-        <w:t>Jalankan FastAPI dan Ollama sebagai systemd service dengan restart policy.</w:t>
+        <w:t>Run FastAPI and Ollama as a systemd service with restart policy.</w:t>
       </w:r>
     </w:p>
     <w:p>
@@ -5806,7 +5806,7 @@
         <w:pStyle w:val="ListBullet"/>
       </w:pPr>
       <w:r>
-        <w:t>Gunakan satu worker FastAPI bila Ollama berada pada VM yang sama.</w:t>
+        <w:t>Use one FastAPI worker when Ollama runs on the same VM.</w:t>
       </w:r>
     </w:p>
     <w:p>
@@ -5814,7 +5814,7 @@
         <w:pStyle w:val="ListBullet"/>
       </w:pPr>
       <w:r>
-        <w:t>Sediakan health check untuk API, RPC, model, disk, dan database.</w:t>
+        <w:t>Provide health checks for APIs, RPCs, models, disks, and databases.</w:t>
       </w:r>
     </w:p>
     <w:p>
@@ -5822,7 +5822,7 @@
         <w:pStyle w:val="ListBullet"/>
       </w:pPr>
       <w:r>
-        <w:t>Aktifkan log rotation dan hapus prompt atau data sensitif dari log.</w:t>
+        <w:t>Enable log rotation and remove prompts or sensitive data from logs.</w:t>
       </w:r>
     </w:p>
     <w:p>
@@ -5830,7 +5830,7 @@
         <w:pStyle w:val="ListBullet"/>
       </w:pPr>
       <w:r>
-        <w:t>Pantau CPU, RAM, swap, disk, latency AI, error rate, dan kegagalan RPC.</w:t>
+        <w:t>Monitor CPU, RAM, swap, disk, AI latency, error rate, and RPC failures.</w:t>
       </w:r>
     </w:p>
     <w:p>
@@ -5838,7 +5838,7 @@
         <w:pStyle w:val="ListBullet"/>
       </w:pPr>
       <w:r>
-        <w:t>Gunakan SQLite WAL dan busy timeout untuk mengurangi lock pada beban bersamaan.</w:t>
+        <w:t>Use SQLite WAL and a busy timeout to reduce lock contention under concurrent load.</w:t>
       </w:r>
     </w:p>
     <w:p>
@@ -5846,7 +5846,7 @@
         <w:pStyle w:val="ListBullet"/>
       </w:pPr>
       <w:r>
-        <w:t>Buat backup database serta konfigurasi sebelum mainnet deployment dan setiap perubahan infrastruktur.</w:t>
+        <w:t>Back up the database and configuration before mainnet deployment and every infrastructure change.</w:t>
       </w:r>
     </w:p>
     <w:p>
@@ -5855,7 +5855,7 @@
       </w:pPr>
       <w:r>
         <w:lastRenderedPageBreak/>
-        <w:t>Target Layanan</w:t>
+        <w:t>Service Targets</w:t>
       </w:r>
     </w:p>
     <w:tbl>
@@ -5905,7 +5905,7 @@
                 <w:color w:val="FFFFFF"/>
                 <w:sz w:val="18"/>
               </w:rPr>
-              <w:t>Metrik</w:t>
+              <w:t>Metric</w:t>
             </w:r>
           </w:p>
         </w:tc>
@@ -5957,7 +5957,7 @@
                 <w:color w:val="FFFFFF"/>
                 <w:sz w:val="18"/>
               </w:rPr>
-              <w:t>Tindakan Jika Gagal</w:t>
+              <w:t>Action if Missed</w:t>
             </w:r>
           </w:p>
         </w:tc>
@@ -6008,7 +6008,7 @@
               <w:rPr>
                 <w:sz w:val="17"/>
               </w:rPr>
-              <w:t>Website dan API tersedia selama sesi uji</w:t>
+              <w:t>The website and API are available during the test session</w:t>
             </w:r>
           </w:p>
         </w:tc>
@@ -6031,7 +6031,7 @@
               <w:rPr>
                 <w:sz w:val="17"/>
               </w:rPr>
-              <w:t>Periksa process, DNS, TLS, dan health check</w:t>
+              <w:t>Check the process, DNS, TLS, and health checks</w:t>
             </w:r>
           </w:p>
         </w:tc>
@@ -6084,7 +6084,7 @@
               <w:rPr>
                 <w:sz w:val="17"/>
               </w:rPr>
-              <w:t>P95 maksimal 15 detik</w:t>
+              <w:t>P95 no greater than 15 seconds</w:t>
             </w:r>
           </w:p>
         </w:tc>
@@ -6108,7 +6108,7 @@
               <w:rPr>
                 <w:sz w:val="17"/>
               </w:rPr>
-              <w:t>Pakai model lebih kecil atau fallback manual</w:t>
+              <w:t>Use a smaller model or manual fallback</w:t>
             </w:r>
           </w:p>
         </w:tc>
@@ -6159,7 +6159,7 @@
               <w:rPr>
                 <w:sz w:val="17"/>
               </w:rPr>
-              <w:t>Kurang dari 2 persen pada smoke test</w:t>
+              <w:t>Less than 2 percent on the smoke test.</w:t>
             </w:r>
           </w:p>
         </w:tc>
@@ -6182,7 +6182,7 @@
               <w:rPr>
                 <w:sz w:val="17"/>
               </w:rPr>
-              <w:t>Perbaiki dependency, timeout, atau rate limit</w:t>
+              <w:t>Fix dependency, timeout, or rate limit</w:t>
             </w:r>
           </w:p>
         </w:tc>
@@ -6235,7 +6235,7 @@
               <w:rPr>
                 <w:sz w:val="17"/>
               </w:rPr>
-              <w:t>Status berubah hingga confirmed atau failed</w:t>
+              <w:t>Status progresses to confirmed or failed</w:t>
             </w:r>
           </w:p>
         </w:tc>
@@ -6259,7 +6259,7 @@
               <w:rPr>
                 <w:sz w:val="17"/>
               </w:rPr>
-              <w:t>Periksa polling receipt dan error mapping</w:t>
+              <w:t>Check receipt polling and error mapping</w:t>
             </w:r>
           </w:p>
         </w:tc>
@@ -6310,7 +6310,7 @@
               <w:rPr>
                 <w:sz w:val="17"/>
               </w:rPr>
-              <w:t>Service kembali setelah reboot otomatis</w:t>
+              <w:t>Service recovers automatically after a reboot</w:t>
             </w:r>
           </w:p>
         </w:tc>
@@ -6333,7 +6333,7 @@
               <w:rPr>
                 <w:sz w:val="17"/>
               </w:rPr>
-              <w:t>Perbaiki systemd dependency dan startup order</w:t>
+              <w:t>Fix systemd dependency and startup order</w:t>
             </w:r>
           </w:p>
         </w:tc>
@@ -6357,7 +6357,7 @@
         <w:pStyle w:val="Checklist"/>
       </w:pPr>
       <w:r>
-        <w:t>[ ] Seluruh unit test dan integration test kritis lulus.</w:t>
+        <w:t>[ ] All critical unit and integration tests pass.</w:t>
       </w:r>
     </w:p>
     <w:p>
@@ -6365,7 +6365,7 @@
         <w:pStyle w:val="Checklist"/>
       </w:pPr>
       <w:r>
-        <w:t>[ ] Contract address, ABI, RPC URL, chain ID, dan explorer URL cocok.</w:t>
+        <w:t>[ ] Contract address, ABI, RPC URL, chain ID, and explorer URL match.</w:t>
       </w:r>
     </w:p>
     <w:p>
@@ -6373,7 +6373,7 @@
         <w:pStyle w:val="Checklist"/>
       </w:pPr>
       <w:r>
-        <w:t>[ ] Tidak ada secret pada repository, build artifact, log, atau browser storage.</w:t>
+        <w:t>[ ] There are no secrets in the repository, build artifact, log, or browser storage.</w:t>
       </w:r>
     </w:p>
     <w:p>
@@ -6381,7 +6381,7 @@
         <w:pStyle w:val="Checklist"/>
       </w:pPr>
       <w:r>
-        <w:t>[ ] Fallback manual berfungsi ketika Ollama dihentikan.</w:t>
+        <w:t>[ ] The manual fallback works when Ollama is stopped.</w:t>
       </w:r>
     </w:p>
     <w:p>
@@ -6389,7 +6389,7 @@
         <w:pStyle w:val="Checklist"/>
       </w:pPr>
       <w:r>
-        <w:t>[ ] Demo script berhasil dari jaringan dan browser berbeda.</w:t>
+        <w:t>[ ] The demo script works from different networks and browsers.</w:t>
       </w:r>
     </w:p>
     <w:p>
@@ -6397,7 +6397,7 @@
         <w:pStyle w:val="Checklist"/>
       </w:pPr>
       <w:r>
-        <w:t>[ ] README dan deployment address telah diperbarui.</w:t>
+        <w:t>[ ] README and deployment address have been updated.</w:t>
       </w:r>
     </w:p>
     <w:p>
@@ -6405,7 +6405,7 @@
         <w:pStyle w:val="Heading1"/>
       </w:pPr>
       <w:r>
-        <w:t>7 Fase Deployment</w:t>
+        <w:t>7 Deployment Phase</w:t>
       </w:r>
     </w:p>
     <w:p>
@@ -6413,7 +6413,7 @@
         <w:pStyle w:val="Heading2"/>
       </w:pPr>
       <w:r>
-        <w:t>Topologi Domain</w:t>
+        <w:t>Domain Topology</w:t>
       </w:r>
     </w:p>
     <w:tbl>
@@ -6463,7 +6463,7 @@
                 <w:color w:val="FFFFFF"/>
                 <w:sz w:val="18"/>
               </w:rPr>
-              <w:t>Nama</w:t>
+              <w:t>Name</w:t>
             </w:r>
           </w:p>
         </w:tc>
@@ -6489,7 +6489,7 @@
                 <w:color w:val="FFFFFF"/>
                 <w:sz w:val="18"/>
               </w:rPr>
-              <w:t>Tujuan</w:t>
+              <w:t>Purpose</w:t>
             </w:r>
           </w:p>
         </w:tc>
@@ -6566,7 +6566,7 @@
               <w:rPr>
                 <w:sz w:val="17"/>
               </w:rPr>
-              <w:t>Frontend publik</w:t>
+              <w:t>Public frontend</w:t>
             </w:r>
           </w:p>
         </w:tc>
@@ -6589,7 +6589,7 @@
               <w:rPr>
                 <w:sz w:val="17"/>
               </w:rPr>
-              <w:t>GitHub Pages custom domain</w:t>
+              <w:t>GitHub Pages custom domain name</w:t>
             </w:r>
           </w:p>
         </w:tc>
@@ -6642,7 +6642,7 @@
               <w:rPr>
                 <w:sz w:val="17"/>
               </w:rPr>
-              <w:t>API HTTPS</w:t>
+              <w:t>HTTPS API</w:t>
             </w:r>
           </w:p>
         </w:tc>
@@ -6666,7 +6666,7 @@
               <w:rPr>
                 <w:sz w:val="17"/>
               </w:rPr>
-              <w:t>Oracle Cloud public IP melalui Caddy</w:t>
+              <w:t>Oracle Cloud public IP through Caddy</w:t>
             </w:r>
           </w:p>
         </w:tc>
@@ -6717,7 +6717,7 @@
               <w:rPr>
                 <w:sz w:val="17"/>
               </w:rPr>
-              <w:t>Read write blockchain</w:t>
+              <w:t>Blockchain read/write</w:t>
             </w:r>
           </w:p>
         </w:tc>
@@ -6793,7 +6793,7 @@
               <w:rPr>
                 <w:sz w:val="17"/>
               </w:rPr>
-              <w:t>Read write blockchain</w:t>
+              <w:t>Blockchain read/write</w:t>
             </w:r>
           </w:p>
         </w:tc>
@@ -6833,7 +6833,7 @@
         <w:pStyle w:val="Heading2"/>
       </w:pPr>
       <w:r>
-        <w:t>Deployment Backend</w:t>
+        <w:t>Backend Deployment</w:t>
       </w:r>
     </w:p>
     <w:p>
@@ -6842,7 +6842,7 @@
         <w:ind w:left="374" w:hanging="374"/>
       </w:pPr>
       <w:r>
-        <w:t>1.  Provision VM A1 4 OCPU dan 24 GB RAM dengan Ubuntu ARM64 dan 100 GB boot volume.</w:t>
+        <w:t>1.  Provision VM A1 4 OCPU and 24 GB RAM with Ubuntu ARM64 and 100 GB boot volume.</w:t>
       </w:r>
     </w:p>
     <w:p>
@@ -6851,7 +6851,7 @@
         <w:ind w:left="374" w:hanging="374"/>
       </w:pPr>
       <w:r>
-        <w:t>2.  Pasang security updates, Python runtime, Git, Caddy, dan Ollama ARM64.</w:t>
+        <w:t>2.  Install security updates, Python runtime, Git, Caddy, and Ollama ARM64.</w:t>
       </w:r>
     </w:p>
     <w:p>
@@ -6860,7 +6860,7 @@
         <w:ind w:left="374" w:hanging="374"/>
       </w:pPr>
       <w:r>
-        <w:t>3.  Buat user service non root dan direktori aplikasi dengan permission minimum.</w:t>
+        <w:t>3.  Create a non-root service user and application directory with minimum permissions.</w:t>
       </w:r>
     </w:p>
     <w:p>
@@ -6869,7 +6869,7 @@
         <w:ind w:left="374" w:hanging="374"/>
       </w:pPr>
       <w:r>
-        <w:t>4.  Clone repository menggunakan deploy credential read only bila diperlukan.</w:t>
+        <w:t>4.  Clone the repository with a read-only deployment credential when necessary.</w:t>
       </w:r>
     </w:p>
     <w:p>
@@ -6878,7 +6878,7 @@
         <w:ind w:left="374" w:hanging="374"/>
       </w:pPr>
       <w:r>
-        <w:t>5.  Buat Python virtual environment dan pasang requirements ARM64.</w:t>
+        <w:t>5.  Create a Python virtual environment and install the ARM64 dependencies.</w:t>
       </w:r>
     </w:p>
     <w:p>
@@ -6887,7 +6887,7 @@
         <w:ind w:left="374" w:hanging="374"/>
       </w:pPr>
       <w:r>
-        <w:t>6.  Konfigurasikan environment, CORS, RPC, database path, model, timeout, dan upload limit.</w:t>
+        <w:t>6.  Configure the environment, CORS, RPC, database path, model, timeout, and upload limit.</w:t>
       </w:r>
     </w:p>
     <w:p>
@@ -6896,7 +6896,7 @@
         <w:ind w:left="374" w:hanging="374"/>
       </w:pPr>
       <w:r>
-        <w:t>7.  Jalankan migration atau inisialisasi SQLite dan aktifkan WAL.</w:t>
+        <w:t>7.  Run migrations or initialize SQLite and enable WAL.</w:t>
       </w:r>
     </w:p>
     <w:p>
@@ -6905,7 +6905,7 @@
         <w:ind w:left="374" w:hanging="374"/>
       </w:pPr>
       <w:r>
-        <w:t>8.  Aktifkan systemd unit untuk FastAPI dan Ollama.</w:t>
+        <w:t>8.  Enable the systemd units for FastAPI and Ollama.</w:t>
       </w:r>
     </w:p>
     <w:p>
@@ -6915,7 +6915,7 @@
       </w:pPr>
       <w:r>
         <w:lastRenderedPageBreak/>
-        <w:t>9.  Konfigurasikan Caddy untuk TLS dan reverse proxy ke 127.0.0.1:8000.</w:t>
+        <w:t>9.  Configure Caddy for TLS and reverse proxy to 127.0.0.1:8000.</w:t>
       </w:r>
     </w:p>
     <w:p>
@@ -6924,7 +6924,7 @@
         <w:ind w:left="374" w:hanging="374"/>
       </w:pPr>
       <w:r>
-        <w:t>10.  Uji health endpoint dari internet dan pastikan port 8000 serta 11434 tidak terbuka publik.</w:t>
+        <w:t>10.  Test the health endpoint from the internet and make sure ports 8000 and 11434 are not open to the public.</w:t>
       </w:r>
     </w:p>
     <w:p>
@@ -6932,7 +6932,7 @@
         <w:pStyle w:val="Heading2"/>
       </w:pPr>
       <w:r>
-        <w:t>Deployment Smart Contract</w:t>
+        <w:t>Smart Contract Deployment</w:t>
       </w:r>
     </w:p>
     <w:p>
@@ -6941,7 +6941,7 @@
         <w:ind w:left="374" w:hanging="374"/>
       </w:pPr>
       <w:r>
-        <w:t>1.  Compile contract dengan versi compiler yang dikunci.</w:t>
+        <w:t>1.  Compile the contract with a locked version of the compiler.</w:t>
       </w:r>
     </w:p>
     <w:p>
@@ -6950,7 +6950,7 @@
         <w:ind w:left="374" w:hanging="374"/>
       </w:pPr>
       <w:r>
-        <w:t>2.  Jalankan unit test lokal dan testnet deployment rehearsal.</w:t>
+        <w:t>2.  Run local unit tests and a testnet deployment rehearsal.</w:t>
       </w:r>
     </w:p>
     <w:p>
@@ -6959,7 +6959,7 @@
         <w:ind w:left="374" w:hanging="374"/>
       </w:pPr>
       <w:r>
-        <w:t>3.  Deploy ke BOT Chain testnet Chain ID 968.</w:t>
+        <w:t>3.  Deploy to the BOT Chain testnet Chain ID 968.</w:t>
       </w:r>
     </w:p>
     <w:p>
@@ -6968,7 +6968,7 @@
         <w:ind w:left="374" w:hanging="374"/>
       </w:pPr>
       <w:r>
-        <w:t>4.  Jalankan fungsi setup, deposit, pembayaran valid, dan pembayaran yang harus ditolak.</w:t>
+        <w:t>4.  Run setup, deposit, valid-payment, and rejected-payment scenarios.</w:t>
       </w:r>
     </w:p>
     <w:p>
@@ -6977,7 +6977,7 @@
         <w:ind w:left="374" w:hanging="374"/>
       </w:pPr>
       <w:r>
-        <w:t>5.  Simpan address dan transaction hash pada README.</w:t>
+        <w:t>5.  Save the address and transaction hash in README.</w:t>
       </w:r>
     </w:p>
     <w:p>
@@ -6986,7 +6986,7 @@
         <w:ind w:left="374" w:hanging="374"/>
       </w:pPr>
       <w:r>
-        <w:t>6.  Deploy bytecode yang sama ke BOT Chain mainnet Chain ID 677.</w:t>
+        <w:t>6.  Deploy the same bytecode to BOT Chain mainnet Chain ID 677.</w:t>
       </w:r>
     </w:p>
     <w:p>
@@ -6995,7 +6995,7 @@
         <w:ind w:left="374" w:hanging="374"/>
       </w:pPr>
       <w:r>
-        <w:t>7.  Verifikasi aktivitas contract melalui BOTScan dan simpan mainnet address.</w:t>
+        <w:t>7.  Verify contract activity through BOTScan and save the mainnet address.</w:t>
       </w:r>
     </w:p>
     <w:p>
@@ -7003,7 +7003,7 @@
         <w:pStyle w:val="Heading2"/>
       </w:pPr>
       <w:r>
-        <w:t>Deployment Frontend</w:t>
+        <w:t>Frontend Deployment</w:t>
       </w:r>
     </w:p>
     <w:p>
@@ -7012,7 +7012,7 @@
         <w:ind w:left="374" w:hanging="374"/>
       </w:pPr>
       <w:r>
-        <w:t>1.  Suntikkan contract address dan chain configuration melalui build environment non rahasia.</w:t>
+        <w:t>1.  Inject contract address and chain configuration through a non-secret build environment.</w:t>
       </w:r>
     </w:p>
     <w:p>
@@ -7021,7 +7021,7 @@
         <w:ind w:left="374" w:hanging="374"/>
       </w:pPr>
       <w:r>
-        <w:t>2.  Build frontend produksi dan audit bundle agar tidak mengandung API key.</w:t>
+        <w:t>2.  Build a production frontend and audit bundle so it doesn't contain an API key.</w:t>
       </w:r>
     </w:p>
     <w:p>
@@ -7030,7 +7030,7 @@
         <w:ind w:left="374" w:hanging="374"/>
       </w:pPr>
       <w:r>
-        <w:t>3.  Publish ke GitHub Pages.</w:t>
+        <w:t>3.  Publish to GitHub Pages.</w:t>
       </w:r>
     </w:p>
     <w:p>
@@ -7039,7 +7039,7 @@
         <w:ind w:left="374" w:hanging="374"/>
       </w:pPr>
       <w:r>
-        <w:t>4.  Pasang custom domain dan DNS sesuai guidebook.</w:t>
+        <w:t>4.  Set custom domains and DNS according to the guidebook.</w:t>
       </w:r>
     </w:p>
     <w:p>
@@ -7048,7 +7048,7 @@
         <w:ind w:left="374" w:hanging="374"/>
       </w:pPr>
       <w:r>
-        <w:t>5.  Uji HTTPS, CORS, MetaMask connection, transaction flow, mobile viewport, dan explorer link.</w:t>
+        <w:t>5.  Test HTTPS, CORS, MetaMask connection, transaction flow, the mobile viewport, and explorer links.</w:t>
       </w:r>
     </w:p>
     <w:p>
@@ -7064,7 +7064,7 @@
         <w:pStyle w:val="BodyText"/>
       </w:pPr>
       <w:r>
-        <w:t>Smart contract tidak diubah setelah deployment. Jika frontend atau backend bermasalah, rollback ke artifact release terakhir. Jika contract memiliki cacat kritis sebelum submission, deploy contract baru, perbarui address di frontend dan README, lalu ulangi seluruh smoke test. Pause contract lama agar pengguna tidak salah berinteraksi.</w:t>
+        <w:t>Do not change the smart contract after deployment. If the frontend or backend fails, roll back to the last release artifact. If the smart contract has a critical defect before submission, deploy a new contract, update its address in the frontend and README, and repeat the full smoke test. Pause the old contract to prevent accidental interaction.</w:t>
       </w:r>
     </w:p>
     <w:p>
@@ -7072,7 +7072,7 @@
         <w:pStyle w:val="Heading1"/>
       </w:pPr>
       <w:r>
-        <w:t>8 Pengujian dan Penerimaan</w:t>
+        <w:t>8 Testing and Acceptance</w:t>
       </w:r>
     </w:p>
     <w:p>
@@ -7080,7 +7080,7 @@
         <w:pStyle w:val="Heading2"/>
       </w:pPr>
       <w:r>
-        <w:t>Matriks Pengujian</w:t>
+        <w:t>Test Matrix</w:t>
       </w:r>
     </w:p>
     <w:tbl>
@@ -7156,7 +7156,7 @@
                 <w:color w:val="FFFFFF"/>
                 <w:sz w:val="18"/>
               </w:rPr>
-              <w:t>Skenario</w:t>
+              <w:t>Scenario</w:t>
             </w:r>
           </w:p>
         </w:tc>
@@ -7182,7 +7182,7 @@
                 <w:color w:val="FFFFFF"/>
                 <w:sz w:val="18"/>
               </w:rPr>
-              <w:t>Hasil yang Diharapkan</w:t>
+              <w:t>Expected Result</w:t>
             </w:r>
           </w:p>
         </w:tc>
@@ -7233,7 +7233,7 @@
               <w:rPr>
                 <w:sz w:val="16"/>
               </w:rPr>
-              <w:t>Pembayaran di bawah limit</w:t>
+              <w:t>Payment below the limit</w:t>
             </w:r>
           </w:p>
         </w:tc>
@@ -7256,7 +7256,7 @@
               <w:rPr>
                 <w:sz w:val="16"/>
               </w:rPr>
-              <w:t>Transfer berhasil dan event diterbitkan</w:t>
+              <w:t>Transfer succeeds and an event is emitted</w:t>
             </w:r>
           </w:p>
         </w:tc>
@@ -7309,7 +7309,7 @@
               <w:rPr>
                 <w:sz w:val="16"/>
               </w:rPr>
-              <w:t>Pembayaran melebihi limit</w:t>
+              <w:t>Payment exceeds the limit</w:t>
             </w:r>
           </w:p>
         </w:tc>
@@ -7333,7 +7333,7 @@
               <w:rPr>
                 <w:sz w:val="16"/>
               </w:rPr>
-              <w:t>Revert dengan error yang dipetakan UI</w:t>
+              <w:t>Revert with an error mapped by the UI</w:t>
             </w:r>
           </w:p>
         </w:tc>
@@ -7384,7 +7384,7 @@
               <w:rPr>
                 <w:sz w:val="16"/>
               </w:rPr>
-              <w:t>Penerima tidak diizinkan</w:t>
+              <w:t>Recipient is not allowed</w:t>
             </w:r>
           </w:p>
         </w:tc>
@@ -7407,7 +7407,7 @@
               <w:rPr>
                 <w:sz w:val="16"/>
               </w:rPr>
-              <w:t>Transfer ditolak tanpa perubahan saldo</w:t>
+              <w:t>Transfer is rejected without changing the balance</w:t>
             </w:r>
           </w:p>
         </w:tc>
@@ -7460,7 +7460,7 @@
               <w:rPr>
                 <w:sz w:val="16"/>
               </w:rPr>
-              <w:t>Contract dalam keadaan pause</w:t>
+              <w:t>Smart contract is paused</w:t>
             </w:r>
           </w:p>
         </w:tc>
@@ -7484,7 +7484,7 @@
               <w:rPr>
                 <w:sz w:val="16"/>
               </w:rPr>
-              <w:t>Semua pembayaran ditolak</w:t>
+              <w:t>All payments are rejected</w:t>
             </w:r>
           </w:p>
         </w:tc>
@@ -7535,7 +7535,7 @@
               <w:rPr>
                 <w:sz w:val="16"/>
               </w:rPr>
-              <w:t>Instruksi lengkap</w:t>
+              <w:t>Full instruction</w:t>
             </w:r>
           </w:p>
         </w:tc>
@@ -7558,7 +7558,7 @@
               <w:rPr>
                 <w:sz w:val="16"/>
               </w:rPr>
-              <w:t>JSON sesuai schema dan nilai benar</w:t>
+              <w:t>JSON matches the schema and contains correct values</w:t>
             </w:r>
           </w:p>
         </w:tc>
@@ -7611,7 +7611,7 @@
               <w:rPr>
                 <w:sz w:val="16"/>
               </w:rPr>
-              <w:t>Alamat atau nominal tidak ada</w:t>
+              <w:t>Address or amount is missing</w:t>
             </w:r>
           </w:p>
         </w:tc>
@@ -7635,7 +7635,7 @@
               <w:rPr>
                 <w:sz w:val="16"/>
               </w:rPr>
-              <w:t>Backend meminta klarifikasi</w:t>
+              <w:t>Backend asks for clarification</w:t>
             </w:r>
           </w:p>
         </w:tc>
@@ -7709,7 +7709,7 @@
               <w:rPr>
                 <w:sz w:val="16"/>
               </w:rPr>
-              <w:t>Action di luar daftar ditolak</w:t>
+              <w:t>Unsupported action is rejected</w:t>
             </w:r>
           </w:p>
         </w:tc>
@@ -7786,7 +7786,7 @@
               <w:rPr>
                 <w:sz w:val="16"/>
               </w:rPr>
-              <w:t>UI menawarkan network switch</w:t>
+              <w:t>The UI offers a network switch</w:t>
             </w:r>
           </w:p>
         </w:tc>
@@ -7837,7 +7837,7 @@
               <w:rPr>
                 <w:sz w:val="16"/>
               </w:rPr>
-              <w:t>Pengguna menolak signature</w:t>
+              <w:t>User rejects the signature request</w:t>
             </w:r>
           </w:p>
         </w:tc>
@@ -7860,7 +7860,7 @@
               <w:rPr>
                 <w:sz w:val="16"/>
               </w:rPr>
-              <w:t>Status dibatalkan tanpa error palsu</w:t>
+              <w:t>Status canceled without a false error</w:t>
             </w:r>
           </w:p>
         </w:tc>
@@ -7890,7 +7890,7 @@
                 <w:sz w:val="16"/>
               </w:rPr>
               <w:lastRenderedPageBreak/>
-              <w:t>RPC</w:t>
+              <w:t>RPCs</w:t>
             </w:r>
           </w:p>
         </w:tc>
@@ -7914,7 +7914,7 @@
               <w:rPr>
                 <w:sz w:val="16"/>
               </w:rPr>
-              <w:t>Timeout atau unavailable</w:t>
+              <w:t>Timeout or unavailable</w:t>
             </w:r>
           </w:p>
         </w:tc>
@@ -7938,7 +7938,7 @@
               <w:rPr>
                 <w:sz w:val="16"/>
               </w:rPr>
-              <w:t>Pesan retry dan fallback ditampilkan</w:t>
+              <w:t>Retry and fallback messages are displayed</w:t>
             </w:r>
           </w:p>
         </w:tc>
@@ -7989,7 +7989,7 @@
               <w:rPr>
                 <w:sz w:val="16"/>
               </w:rPr>
-              <w:t>Rate limit terlampaui</w:t>
+              <w:t>Rate limit exceeded</w:t>
             </w:r>
           </w:p>
         </w:tc>
@@ -8012,7 +8012,7 @@
               <w:rPr>
                 <w:sz w:val="16"/>
               </w:rPr>
-              <w:t>HTTP 429 dan UI tetap stabil</w:t>
+              <w:t>HTTP 429; UI remains stable</w:t>
             </w:r>
           </w:p>
         </w:tc>
@@ -8089,7 +8089,7 @@
               <w:rPr>
                 <w:sz w:val="16"/>
               </w:rPr>
-              <w:t>Caddy, FastAPI, dan Ollama kembali otomatis</w:t>
+              <w:t>Caddy, FastAPI, and Ollama are back automatically.</w:t>
             </w:r>
           </w:p>
         </w:tc>
@@ -8105,7 +8105,7 @@
         <w:pStyle w:val="Heading2"/>
       </w:pPr>
       <w:r>
-        <w:t>Uji End to End Wajib</w:t>
+        <w:t>Required End-to-End Test</w:t>
       </w:r>
     </w:p>
     <w:p>
@@ -8113,7 +8113,7 @@
         <w:pStyle w:val="Checklist"/>
       </w:pPr>
       <w:r>
-        <w:t>[ ] Browser baru tanpa localStorage membuka domain produksi.</w:t>
+        <w:t>[ ] A new browser without localStorage opens the production domain.</w:t>
       </w:r>
     </w:p>
     <w:p>
@@ -8121,7 +8121,7 @@
         <w:pStyle w:val="Checklist"/>
       </w:pPr>
       <w:r>
-        <w:t>[ ] MetaMask test wallet dapat terhubung dan berpindah ke BOT Chain testnet.</w:t>
+        <w:t>[ ] The MetaMask test wallet can connect and switch to BOT Chain testnet.</w:t>
       </w:r>
     </w:p>
     <w:p>
@@ -8129,7 +8129,7 @@
         <w:pStyle w:val="Checklist"/>
       </w:pPr>
       <w:r>
-        <w:t>[ ] Pengguna membuat policy dan contract mengembalikan state yang benar.</w:t>
+        <w:t>[ ] The user creates a policy and the smart contract returns the correct state.</w:t>
       </w:r>
     </w:p>
     <w:p>
@@ -8137,7 +8137,7 @@
         <w:pStyle w:val="Checklist"/>
       </w:pPr>
       <w:r>
-        <w:t>[ ] Instruksi pembayaran menghasilkan preview yang sesuai.</w:t>
+        <w:t>[ ] The payment instructions produce a proper preview.</w:t>
       </w:r>
     </w:p>
     <w:p>
@@ -8145,7 +8145,7 @@
         <w:pStyle w:val="Checklist"/>
       </w:pPr>
       <w:r>
-        <w:t>[ ] Pembayaran valid berhasil dan tampil pada explorer.</w:t>
+        <w:t>[ ] A valid payment succeeds and appears in the explorer.</w:t>
       </w:r>
     </w:p>
     <w:p>
@@ -8153,7 +8153,7 @@
         <w:pStyle w:val="Checklist"/>
       </w:pPr>
       <w:r>
-        <w:t>[ ] Pembayaran invalid ditolak dengan pesan yang dapat dipahami.</w:t>
+        <w:t>[ ] An invalid payment is rejected with a clear message.</w:t>
       </w:r>
     </w:p>
     <w:p>
@@ -8161,7 +8161,7 @@
         <w:pStyle w:val="Checklist"/>
       </w:pPr>
       <w:r>
-        <w:t>[ ] Alur manual tetap berhasil ketika layanan AI tidak tersedia.</w:t>
+        <w:t>[ ] The manual flow still works when the AI service is unavailable.</w:t>
       </w:r>
     </w:p>
     <w:p>
@@ -8169,7 +8169,7 @@
         <w:pStyle w:val="Heading2"/>
       </w:pPr>
       <w:r>
-        <w:t>Skenario Demo</w:t>
+        <w:t>Demo Scenario</w:t>
       </w:r>
     </w:p>
     <w:p>
@@ -8178,7 +8178,7 @@
         <w:ind w:left="374" w:hanging="374"/>
       </w:pPr>
       <w:r>
-        <w:t>1.  Tunjukkan wallet dan policy dengan maksimum 0.02 BOT per transaksi.</w:t>
+        <w:t>1.  Show the wallet and policy with a maximum of 0.02 BOT per transaction.</w:t>
       </w:r>
     </w:p>
     <w:p>
@@ -8187,7 +8187,7 @@
         <w:ind w:left="374" w:hanging="374"/>
       </w:pPr>
       <w:r>
-        <w:t>2.  Masukkan instruksi pembayaran 0.01 BOT kepada alamat yang diizinkan.</w:t>
+        <w:t>2.  Enter a 0.01 BOT payment instruction for an allowlisted address.</w:t>
       </w:r>
     </w:p>
     <w:p>
@@ -8196,7 +8196,7 @@
         <w:ind w:left="374" w:hanging="374"/>
       </w:pPr>
       <w:r>
-        <w:t>3.  Tunjukkan JSON intent dan preview tanpa memperlihatkan secret.</w:t>
+        <w:t>3.  Show the JSON intent and preview without exposing secrets.</w:t>
       </w:r>
     </w:p>
     <w:p>
@@ -8205,7 +8205,7 @@
         <w:ind w:left="374" w:hanging="374"/>
       </w:pPr>
       <w:r>
-        <w:t>4.  Konfirmasi melalui MetaMask dan buka transaction hash di explorer.</w:t>
+        <w:t>4.  Confirm through MetaMask and open the transaction hash in the explorer.</w:t>
       </w:r>
     </w:p>
     <w:p>
@@ -8214,7 +8214,7 @@
         <w:ind w:left="374" w:hanging="374"/>
       </w:pPr>
       <w:r>
-        <w:t>5.  Ulangi dengan nominal 0.05 BOT untuk menunjukkan penolakan contract.</w:t>
+        <w:t>5.  Repeat with an amount of 0.05 BOT to demonstrate smart contract rejection.</w:t>
       </w:r>
     </w:p>
     <w:p>
@@ -8222,7 +8222,7 @@
         <w:pStyle w:val="Heading1"/>
       </w:pPr>
       <w:r>
-        <w:t>9 Jadwal Pelaksanaan</w:t>
+        <w:t>9 Implementation Schedule</w:t>
       </w:r>
     </w:p>
     <w:p>
@@ -8230,7 +8230,7 @@
         <w:pStyle w:val="BodyText"/>
       </w:pPr>
       <w:r>
-        <w:t>Jadwal mengikuti periode Build Week. Prioritas diberikan kepada contract dan alur wallet karena keduanya membentuk mayoritas nilai teknis dan menentukan apakah juri dapat menggunakan produk.</w:t>
+        <w:t>The schedule follows the Build Week period. The smart contract and wallet flow take priority because they represent most of the technical value and determine whether judges can use the product.</w:t>
       </w:r>
     </w:p>
     <w:tbl>
@@ -8280,7 +8280,7 @@
                 <w:color w:val="FFFFFF"/>
                 <w:sz w:val="18"/>
               </w:rPr>
-              <w:t>Tanggal</w:t>
+              <w:t>Date</w:t>
             </w:r>
           </w:p>
         </w:tc>
@@ -8306,7 +8306,7 @@
                 <w:color w:val="FFFFFF"/>
                 <w:sz w:val="18"/>
               </w:rPr>
-              <w:t>Fokus</w:t>
+              <w:t>Focus</w:t>
             </w:r>
           </w:p>
         </w:tc>
@@ -8360,7 +8360,7 @@
               <w:rPr>
                 <w:sz w:val="16"/>
               </w:rPr>
-              <w:t>13 sampai 14 Sep</w:t>
+              <w:t>13 to 14 Sep</w:t>
             </w:r>
           </w:p>
         </w:tc>
@@ -8406,7 +8406,7 @@
               <w:rPr>
                 <w:sz w:val="16"/>
               </w:rPr>
-              <w:t>Scope, arsitektur, repository, wallet, dan Oracle VM siap</w:t>
+              <w:t>Scope, architecture, repository, wallet, and Oracle VM ready</w:t>
             </w:r>
           </w:p>
         </w:tc>
@@ -8435,7 +8435,7 @@
               <w:rPr>
                 <w:sz w:val="16"/>
               </w:rPr>
-              <w:t>15 sampai 17 Sep</w:t>
+              <w:t>15 to 17 Sep</w:t>
             </w:r>
           </w:p>
         </w:tc>
@@ -8483,7 +8483,7 @@
               <w:rPr>
                 <w:sz w:val="16"/>
               </w:rPr>
-              <w:t>Contract skeleton, wallet connect, API contract, dan deployment script</w:t>
+              <w:t>Contract skeleton, wallet connect, API contract, and deployment script</w:t>
             </w:r>
           </w:p>
         </w:tc>
@@ -8511,7 +8511,7 @@
               <w:rPr>
                 <w:sz w:val="16"/>
               </w:rPr>
-              <w:t>18 Sep</w:t>
+              <w:t>18th of September</w:t>
             </w:r>
           </w:p>
         </w:tc>
@@ -8557,7 +8557,7 @@
               <w:rPr>
                 <w:sz w:val="16"/>
               </w:rPr>
-              <w:t>Unit test dan testnet deployment pertama</w:t>
+              <w:t>Unit tests and first testnet deployment</w:t>
             </w:r>
           </w:p>
         </w:tc>
@@ -8586,7 +8586,7 @@
               <w:rPr>
                 <w:sz w:val="16"/>
               </w:rPr>
-              <w:t>19 Sep</w:t>
+              <w:t>19th of September</w:t>
             </w:r>
           </w:p>
         </w:tc>
@@ -8634,7 +8634,7 @@
               <w:rPr>
                 <w:sz w:val="16"/>
               </w:rPr>
-              <w:t>Policy setup dan pembayaran manual testnet</w:t>
+              <w:t>Policy setup and manual testnet payment</w:t>
             </w:r>
           </w:p>
         </w:tc>
@@ -8662,7 +8662,7 @@
               <w:rPr>
                 <w:sz w:val="16"/>
               </w:rPr>
-              <w:t>20 Sep</w:t>
+              <w:t>20th of September</w:t>
             </w:r>
           </w:p>
         </w:tc>
@@ -8685,7 +8685,7 @@
               <w:rPr>
                 <w:sz w:val="16"/>
               </w:rPr>
-              <w:t>AI integration</w:t>
+              <w:t>AI Integration</w:t>
             </w:r>
           </w:p>
         </w:tc>
@@ -8708,7 +8708,7 @@
               <w:rPr>
                 <w:sz w:val="16"/>
               </w:rPr>
-              <w:t>Intent parser, validation, preview, dan fallback</w:t>
+              <w:t>Intent parser, validation, preview, and fallback</w:t>
             </w:r>
           </w:p>
         </w:tc>
@@ -8785,7 +8785,7 @@
               <w:rPr>
                 <w:sz w:val="16"/>
               </w:rPr>
-              <w:t>End to end test, error handling, dan observability</w:t>
+              <w:t>End to end test, error handling, and observability</w:t>
             </w:r>
           </w:p>
         </w:tc>
@@ -8859,7 +8859,7 @@
               <w:rPr>
                 <w:sz w:val="16"/>
               </w:rPr>
-              <w:t>Mainnet deploy, domain, README, screenshot, dan demo rehearsal</w:t>
+              <w:t>Mainnet deployment, domain, README, screenshots, and demo rehearsal</w:t>
             </w:r>
           </w:p>
         </w:tc>
@@ -8936,7 +8936,7 @@
               <w:rPr>
                 <w:sz w:val="16"/>
               </w:rPr>
-              <w:t>Contract address, live site, GitHub repository, dan X post submitted</w:t>
+              <w:t>Contract address, live site, GitHub repository, and X post submitted</w:t>
             </w:r>
           </w:p>
         </w:tc>
@@ -8964,7 +8964,7 @@
               <w:rPr>
                 <w:sz w:val="16"/>
               </w:rPr>
-              <w:t>24 sampai 30 Sep</w:t>
+              <w:t>24 to 30 Sep</w:t>
             </w:r>
           </w:p>
         </w:tc>
@@ -9010,7 +9010,7 @@
               <w:rPr>
                 <w:sz w:val="16"/>
               </w:rPr>
-              <w:t>Server monitoring, incident response, dan tidak ada fitur baru</w:t>
+              <w:t>Server monitoring, incident response, and no new features</w:t>
             </w:r>
           </w:p>
         </w:tc>
@@ -9040,7 +9040,7 @@
                 <w:sz w:val="16"/>
               </w:rPr>
               <w:lastRenderedPageBreak/>
-              <w:t>Sebelum trial berakhir</w:t>
+              <w:t>Before trial expiry</w:t>
             </w:r>
           </w:p>
         </w:tc>
@@ -9088,7 +9088,7 @@
               <w:rPr>
                 <w:sz w:val="16"/>
               </w:rPr>
-              <w:t>Backup dan resize A1 menjadi 2 OCPU serta 12 GB</w:t>
+              <w:t>Backup and resize A1 to 2 OCPUs and 12 GB</w:t>
             </w:r>
           </w:p>
         </w:tc>
@@ -9104,7 +9104,7 @@
         <w:pStyle w:val="Heading2"/>
       </w:pPr>
       <w:r>
-        <w:t>Prioritas Jika Waktu Terbatas</w:t>
+        <w:t>Priorities When Time Is Limited</w:t>
       </w:r>
     </w:p>
     <w:p>
@@ -9113,7 +9113,7 @@
         <w:ind w:left="374" w:hanging="374"/>
       </w:pPr>
       <w:r>
-        <w:t>1.  Pastikan contract bekerja pada BOT Chain dan memiliki transaksi nyata.</w:t>
+        <w:t>1.  Ensure the smart contract works on BOT Chain and has real transactions.</w:t>
       </w:r>
     </w:p>
     <w:p>
@@ -9122,7 +9122,7 @@
         <w:ind w:left="374" w:hanging="374"/>
       </w:pPr>
       <w:r>
-        <w:t>2.  Pastikan wallet dapat terhubung dan main action berhasil.</w:t>
+        <w:t>2.  Ensure the wallet connects and the main action succeeds.</w:t>
       </w:r>
     </w:p>
     <w:p>
@@ -9131,7 +9131,7 @@
         <w:ind w:left="374" w:hanging="374"/>
       </w:pPr>
       <w:r>
-        <w:t>3.  Pastikan domain, README, deployment address, dan X post tersedia.</w:t>
+        <w:t>3.  Make sure the domain, README, deployment address, and X post are available.</w:t>
       </w:r>
     </w:p>
     <w:p>
@@ -9140,7 +9140,7 @@
         <w:ind w:left="374" w:hanging="374"/>
       </w:pPr>
       <w:r>
-        <w:t>4.  Perbaiki pesan error dan stabilitas demo.</w:t>
+        <w:t>4.  Fix the error message and demo stability.</w:t>
       </w:r>
     </w:p>
     <w:p>
@@ -9149,7 +9149,7 @@
         <w:ind w:left="374" w:hanging="374"/>
       </w:pPr>
       <w:r>
-        <w:t>5.  Kerjakan fitur tambahan hanya jika seluruh item sebelumnya sudah lulus.</w:t>
+        <w:t>5.  Only work on additional features if all previous items have passed.</w:t>
       </w:r>
     </w:p>
     <w:p>
@@ -9159,7 +9159,7 @@
       </w:pPr>
       <w:r>
         <w:lastRenderedPageBreak/>
-        <w:t>10 Risiko dan Mitigasi</w:t>
+        <w:t>10 Risks and Mitigations</w:t>
       </w:r>
     </w:p>
     <w:tbl>
@@ -9210,7 +9210,7 @@
                 <w:color w:val="FFFFFF"/>
                 <w:sz w:val="18"/>
               </w:rPr>
-              <w:t>Risiko</w:t>
+              <w:t>Risk</w:t>
             </w:r>
           </w:p>
         </w:tc>
@@ -9236,7 +9236,7 @@
                 <w:color w:val="FFFFFF"/>
                 <w:sz w:val="18"/>
               </w:rPr>
-              <w:t>Dampak</w:t>
+              <w:t>Impact</w:t>
             </w:r>
           </w:p>
         </w:tc>
@@ -9262,7 +9262,7 @@
                 <w:color w:val="FFFFFF"/>
                 <w:sz w:val="18"/>
               </w:rPr>
-              <w:t>Mitigasi</w:t>
+              <w:t>Mitigation</w:t>
             </w:r>
           </w:p>
         </w:tc>
@@ -9288,7 +9288,7 @@
                 <w:color w:val="FFFFFF"/>
                 <w:sz w:val="18"/>
               </w:rPr>
-              <w:t>Pemicu Eskalasi</w:t>
+              <w:t>Escalation Trigger</w:t>
             </w:r>
           </w:p>
         </w:tc>
@@ -9339,7 +9339,7 @@
               <w:rPr>
                 <w:sz w:val="15"/>
               </w:rPr>
-              <w:t>VM tidak dapat dibuat</w:t>
+              <w:t>VM cannot be created</w:t>
             </w:r>
           </w:p>
         </w:tc>
@@ -9362,7 +9362,7 @@
               <w:rPr>
                 <w:sz w:val="15"/>
               </w:rPr>
-              <w:t>Pilih availability domain lain atau gunakan x86 Flex selama trial</w:t>
+              <w:t>Choose another availability domain or use x86 Flex during the trial</w:t>
             </w:r>
           </w:p>
         </w:tc>
@@ -9385,7 +9385,7 @@
               <w:rPr>
                 <w:sz w:val="15"/>
               </w:rPr>
-              <w:t>Provisioning gagal berulang</w:t>
+              <w:t>Provisioning fails repeatedly</w:t>
             </w:r>
           </w:p>
         </w:tc>
@@ -9414,7 +9414,7 @@
               <w:rPr>
                 <w:sz w:val="15"/>
               </w:rPr>
-              <w:t>Qwen 9B terlalu lambat</w:t>
+              <w:t>Qwen 9B is too slow.</w:t>
             </w:r>
           </w:p>
         </w:tc>
@@ -9438,7 +9438,7 @@
               <w:rPr>
                 <w:sz w:val="15"/>
               </w:rPr>
-              <w:t>Demo menunggu lama</w:t>
+              <w:t>The demo takes too long</w:t>
             </w:r>
           </w:p>
         </w:tc>
@@ -9462,7 +9462,7 @@
               <w:rPr>
                 <w:sz w:val="15"/>
               </w:rPr>
-              <w:t>Model 1B sampai 3B dan fallback manual</w:t>
+              <w:t>Model 1B to 3B and manual fallback</w:t>
             </w:r>
           </w:p>
         </w:tc>
@@ -9486,7 +9486,7 @@
               <w:rPr>
                 <w:sz w:val="15"/>
               </w:rPr>
-              <w:t>P95 lebih dari 15 detik</w:t>
+              <w:t>P95 over 15 seconds</w:t>
             </w:r>
           </w:p>
         </w:tc>
@@ -9514,7 +9514,7 @@
               <w:rPr>
                 <w:sz w:val="15"/>
               </w:rPr>
-              <w:t>Ollama crash atau OOM</w:t>
+              <w:t>Ollama crash or OOM</w:t>
             </w:r>
           </w:p>
         </w:tc>
@@ -9537,7 +9537,7 @@
               <w:rPr>
                 <w:sz w:val="15"/>
               </w:rPr>
-              <w:t>Intent parser gagal</w:t>
+              <w:t>Intent parser fails</w:t>
             </w:r>
           </w:p>
         </w:tc>
@@ -9560,7 +9560,7 @@
               <w:rPr>
                 <w:sz w:val="15"/>
               </w:rPr>
-              <w:t>Concurrency satu, swap, restart policy, health check</w:t>
+              <w:t>Single concurrency, swap, restart policy, and health checks</w:t>
             </w:r>
           </w:p>
         </w:tc>
@@ -9583,7 +9583,7 @@
               <w:rPr>
                 <w:sz w:val="15"/>
               </w:rPr>
-              <w:t>Memory pressure dan restart berulang</w:t>
+              <w:t>Memory pressure and repeated restarts</w:t>
             </w:r>
           </w:p>
         </w:tc>
@@ -9636,7 +9636,7 @@
               <w:rPr>
                 <w:sz w:val="15"/>
               </w:rPr>
-              <w:t>Read atau submit gagal</w:t>
+              <w:t>Reads or submissions fail</w:t>
             </w:r>
           </w:p>
         </w:tc>
@@ -9660,7 +9660,7 @@
               <w:rPr>
                 <w:sz w:val="15"/>
               </w:rPr>
-              <w:t>Retry terbatas, status jelas, dan RPC fallback bila tersedia</w:t>
+              <w:t>Bounded retries, clear status, and RPC fallback when available</w:t>
             </w:r>
           </w:p>
         </w:tc>
@@ -9684,7 +9684,7 @@
               <w:rPr>
                 <w:sz w:val="15"/>
               </w:rPr>
-              <w:t>Error rate RPC meningkat</w:t>
+              <w:t>RPC error rate increases</w:t>
             </w:r>
           </w:p>
         </w:tc>
@@ -9712,7 +9712,7 @@
               <w:rPr>
                 <w:sz w:val="15"/>
               </w:rPr>
-              <w:t>Contract bug</w:t>
+              <w:t>Smart contract bug</w:t>
             </w:r>
           </w:p>
         </w:tc>
@@ -9735,7 +9735,7 @@
               <w:rPr>
                 <w:sz w:val="15"/>
               </w:rPr>
-              <w:t>Dana atau demo berisiko</w:t>
+              <w:t>Funds or demo are at risk</w:t>
             </w:r>
           </w:p>
         </w:tc>
@@ -9758,7 +9758,7 @@
               <w:rPr>
                 <w:sz w:val="15"/>
               </w:rPr>
-              <w:t>Unit test, testnet rehearsal, pause, dan saldo kecil</w:t>
+              <w:t>Unit tests, testnet rehearsal, pause, and a small balance</w:t>
             </w:r>
           </w:p>
         </w:tc>
@@ -9781,7 +9781,7 @@
               <w:rPr>
                 <w:sz w:val="15"/>
               </w:rPr>
-              <w:t>Revert tak terjelaskan atau state salah</w:t>
+              <w:t>Unexplained revert or incorrect state</w:t>
             </w:r>
           </w:p>
         </w:tc>
@@ -9810,7 +9810,7 @@
               <w:rPr>
                 <w:sz w:val="15"/>
               </w:rPr>
-              <w:t>Secret bocor</w:t>
+              <w:t>Secret exposure</w:t>
             </w:r>
           </w:p>
         </w:tc>
@@ -9834,7 +9834,7 @@
               <w:rPr>
                 <w:sz w:val="15"/>
               </w:rPr>
-              <w:t>Akses layanan disalahgunakan</w:t>
+              <w:t>Unauthorized service access</w:t>
             </w:r>
           </w:p>
         </w:tc>
@@ -9858,7 +9858,7 @@
               <w:rPr>
                 <w:sz w:val="15"/>
               </w:rPr>
-              <w:t>Vault atau environment file dan secret scan</w:t>
+              <w:t>Vault or environment file plus secret scanning</w:t>
             </w:r>
           </w:p>
         </w:tc>
@@ -9882,7 +9882,7 @@
               <w:rPr>
                 <w:sz w:val="15"/>
               </w:rPr>
-              <w:t>Secret terdeteksi pada git atau bundle</w:t>
+              <w:t>Secret found in Git or the bundle</w:t>
             </w:r>
           </w:p>
         </w:tc>
@@ -9910,7 +9910,7 @@
               <w:rPr>
                 <w:sz w:val="15"/>
               </w:rPr>
-              <w:t>Free Trial berakhir</w:t>
+              <w:t>Free Trial expires</w:t>
             </w:r>
           </w:p>
         </w:tc>
@@ -9933,7 +9933,7 @@
               <w:rPr>
                 <w:sz w:val="15"/>
               </w:rPr>
-              <w:t>Instance dihentikan</w:t>
+              <w:t>Instance stops</w:t>
             </w:r>
           </w:p>
         </w:tc>
@@ -9956,7 +9956,7 @@
               <w:rPr>
                 <w:sz w:val="15"/>
               </w:rPr>
-              <w:t>Alert tanggal expiry, backup, resize sebelum deadline</w:t>
+              <w:t>Expiration alert, backup, and resize before the deadline</w:t>
             </w:r>
           </w:p>
         </w:tc>
@@ -9979,7 +9979,7 @@
               <w:rPr>
                 <w:sz w:val="15"/>
               </w:rPr>
-              <w:t>Sisa trial kurang dari lima hari</w:t>
+              <w:t>Fewer than five trial days remain</w:t>
             </w:r>
           </w:p>
         </w:tc>
@@ -10008,7 +10008,7 @@
               <w:rPr>
                 <w:sz w:val="15"/>
               </w:rPr>
-              <w:t>Frontend tidak cocok MetaMask</w:t>
+              <w:t>Frontend is incompatible with MetaMask</w:t>
             </w:r>
           </w:p>
         </w:tc>
@@ -10032,7 +10032,7 @@
               <w:rPr>
                 <w:sz w:val="15"/>
               </w:rPr>
-              <w:t>Juri tidak dapat mencoba</w:t>
+              <w:t>Judges cannot test the product</w:t>
             </w:r>
           </w:p>
         </w:tc>
@@ -10056,7 +10056,7 @@
               <w:rPr>
                 <w:sz w:val="15"/>
               </w:rPr>
-              <w:t>Web frontend terpisah dan browser compatibility test</w:t>
+              <w:t>Separate web frontend and browser compatibility test</w:t>
             </w:r>
           </w:p>
         </w:tc>
@@ -10080,7 +10080,7 @@
               <w:rPr>
                 <w:sz w:val="15"/>
               </w:rPr>
-              <w:t>Wallet provider tidak terdeteksi</w:t>
+              <w:t>Wallet provider undetected</w:t>
             </w:r>
           </w:p>
         </w:tc>
@@ -10096,7 +10096,7 @@
         <w:pStyle w:val="Heading2"/>
       </w:pPr>
       <w:r>
-        <w:t>Aturan Perubahan Saat Penilaian</w:t>
+        <w:t>Change Rules During Judging</w:t>
       </w:r>
     </w:p>
     <w:p>
@@ -10104,7 +10104,7 @@
         <w:pStyle w:val="ListBullet"/>
       </w:pPr>
       <w:r>
-        <w:t>Jangan melakukan perubahan contract setelah mainnet release kecuali ada cacat kritis.</w:t>
+        <w:t>Do not change the smart contract after the mainnet release unless it has a critical defect.</w:t>
       </w:r>
     </w:p>
     <w:p>
@@ -10112,7 +10112,7 @@
         <w:pStyle w:val="ListBullet"/>
       </w:pPr>
       <w:r>
-        <w:t>Jangan memperbarui dependency tanpa regression test.</w:t>
+        <w:t>Don't update the dependency without a regression test.</w:t>
       </w:r>
     </w:p>
     <w:p>
@@ -10120,7 +10120,7 @@
         <w:pStyle w:val="ListBullet"/>
       </w:pPr>
       <w:r>
-        <w:t>Gunakan rollback frontend atau backend jika hotfix gagal.</w:t>
+        <w:t>Use rollback frontend or backend if the hotfix fails.</w:t>
       </w:r>
     </w:p>
     <w:p>
@@ -10128,7 +10128,7 @@
         <w:pStyle w:val="ListBullet"/>
       </w:pPr>
       <w:r>
-        <w:t>Catat waktu incident, gejala, tindakan, dan hasil pemulihan.</w:t>
+        <w:t>Record the incident time, symptoms, actions, and recovery results.</w:t>
       </w:r>
     </w:p>
     <w:p>
@@ -10136,7 +10136,7 @@
         <w:pStyle w:val="ListBullet"/>
       </w:pPr>
       <w:r>
-        <w:t>Simpan saldo deployment wallet pada jumlah minimum yang diperlukan.</w:t>
+        <w:t>Keep the deployment wallet balance to the minimum amount required.</w:t>
       </w:r>
     </w:p>
     <w:p>
@@ -10144,7 +10144,7 @@
         <w:pStyle w:val="Heading1"/>
       </w:pPr>
       <w:r>
-        <w:t>11 Checklist Submission</w:t>
+        <w:t>11 Submission Checklist</w:t>
       </w:r>
     </w:p>
     <w:p>
@@ -10152,7 +10152,7 @@
         <w:pStyle w:val="Checklist"/>
       </w:pPr>
       <w:r>
-        <w:t>[ ] Contract address BOT Chain testnet tersimpan dan dapat dibuka di explorer.</w:t>
+        <w:t>[ ] The BOT Chain testnet smart contract address is recorded and opens in the explorer.</w:t>
       </w:r>
     </w:p>
     <w:p>
@@ -10160,7 +10160,7 @@
         <w:pStyle w:val="Checklist"/>
       </w:pPr>
       <w:r>
-        <w:t>[ ] Contract address BOT Chain mainnet tersimpan dan dapat dibuka di explorer.</w:t>
+        <w:t>[ ] The BOT Chain mainnet smart contract address is recorded and opens in the explorer.</w:t>
       </w:r>
     </w:p>
     <w:p>
@@ -10168,7 +10168,7 @@
         <w:pStyle w:val="Checklist"/>
       </w:pPr>
       <w:r>
-        <w:t>[ ] Contract memiliki aktivitas on chain yang dapat diverifikasi.</w:t>
+        <w:t>[ ] Contract has verifiable on-chain activity.</w:t>
       </w:r>
     </w:p>
     <w:p>
@@ -10176,7 +10176,7 @@
         <w:pStyle w:val="Checklist"/>
       </w:pPr>
       <w:r>
-        <w:t>[ ] Live website dapat dibuka melalui custom domain HTTPS.</w:t>
+        <w:t>[ ] Live websites can be opened via custom HTTPS domains.</w:t>
       </w:r>
     </w:p>
     <w:p>
@@ -10184,7 +10184,7 @@
         <w:pStyle w:val="Checklist"/>
       </w:pPr>
       <w:r>
-        <w:t>[ ] Juri dapat menghubungkan MetaMask dan menjalankan main action.</w:t>
+        <w:t>[ ] Judges can connect MetaMask and run the main action.</w:t>
       </w:r>
     </w:p>
     <w:p>
@@ -10192,7 +10192,7 @@
         <w:pStyle w:val="Checklist"/>
       </w:pPr>
       <w:r>
-        <w:t>[ ] Repository GitHub memuat file Solidity dan README berbahasa Inggris.</w:t>
+        <w:t>[ ] The GitHub repository contains the Solidity file and an English README.</w:t>
       </w:r>
     </w:p>
     <w:p>
@@ -10200,7 +10200,7 @@
         <w:pStyle w:val="Checklist"/>
       </w:pPr>
       <w:r>
-        <w:t>[ ] README memiliki bagian Deployment dengan address testnet dan mainnet.</w:t>
+        <w:t>[ ] README has a Deployment section with testnet and mainnet addresses.</w:t>
       </w:r>
     </w:p>
     <w:p>
@@ -10208,7 +10208,7 @@
         <w:pStyle w:val="Checklist"/>
       </w:pPr>
       <w:r>
-        <w:t>[ ] X account proyek dan X post telah dibuat serta menandai @BOTChain_ai.</w:t>
+        <w:t>[ ] The project X account and X post have been created and tag @BOTChain_ai.</w:t>
       </w:r>
     </w:p>
     <w:p>
@@ -10216,7 +10216,7 @@
         <w:pStyle w:val="Checklist"/>
       </w:pPr>
       <w:r>
-        <w:t>[ ] Screenshot atau video pendek menunjukkan alur produk.</w:t>
+        <w:t>[ ] A screenshot or short video demonstrates the product flow.</w:t>
       </w:r>
     </w:p>
     <w:p>
@@ -10224,7 +10224,7 @@
         <w:pStyle w:val="Checklist"/>
       </w:pPr>
       <w:r>
-        <w:t>[ ] Semua tautan dikirim sebelum 23 September 2026 pukul 23 59 GMT plus 7.</w:t>
+        <w:t>[ ] All links are submitted before September 23, 2026 at 23:59 GMT+7.</w:t>
       </w:r>
     </w:p>
     <w:p>
@@ -10234,7 +10234,7 @@
       </w:pPr>
       <w:r>
         <w:lastRenderedPageBreak/>
-        <w:t>12 Operasi Setelah Lomba</w:t>
+        <w:t>12 Post-Hackathon Operations</w:t>
       </w:r>
     </w:p>
     <w:p>
@@ -10242,7 +10242,7 @@
         <w:pStyle w:val="BodyText"/>
       </w:pPr>
       <w:r>
-        <w:t>Server harus tetap tersedia sampai pengumuman pemenang pada 30 September 2026. Selama periode ini, tim memantau uptime, latency, error rate, disk, dan kesehatan RPC. Perubahan dibatasi pada perbaikan yang dapat diuji cepat dan dirollback.</w:t>
+        <w:t>The server must remain available until the winners are announced on September 30, 2026. During this period, the team monitors uptime, latency, error rate, disk usage, and RPC health. Changes are limited to fixes that can be tested quickly and rolled back.</w:t>
       </w:r>
     </w:p>
     <w:p>
@@ -10250,7 +10250,7 @@
         <w:pStyle w:val="Heading2"/>
       </w:pPr>
       <w:r>
-        <w:t>Resize Oracle Cloud</w:t>
+        <w:t>Resize the Oracle Cloud Instance</w:t>
       </w:r>
     </w:p>
     <w:p>
@@ -10259,7 +10259,7 @@
         <w:ind w:left="374" w:hanging="374"/>
       </w:pPr>
       <w:r>
-        <w:t>1.  Catat tanggal pasti berakhirnya Free Trial dari halaman Billing OCI.</w:t>
+        <w:t>1.  Record the exact Free Trial expiration date from the OCI Billing page.</w:t>
       </w:r>
     </w:p>
     <w:p>
@@ -10268,7 +10268,7 @@
         <w:ind w:left="374" w:hanging="374"/>
       </w:pPr>
       <w:r>
-        <w:t>2.  Buat backup SQLite, environment, service unit, dan konfigurasi Caddy.</w:t>
+        <w:t>2.  Back up SQLite, the environment, service units, and the Caddy configuration.</w:t>
       </w:r>
     </w:p>
     <w:p>
@@ -10277,7 +10277,7 @@
         <w:ind w:left="374" w:hanging="374"/>
       </w:pPr>
       <w:r>
-        <w:t>3.  Pastikan repository dan release artifact tersedia di lokasi terpisah.</w:t>
+        <w:t>3.  Make sure the repository and release artifact are available in separate locations.</w:t>
       </w:r>
     </w:p>
     <w:p>
@@ -10286,7 +10286,7 @@
         <w:ind w:left="374" w:hanging="374"/>
       </w:pPr>
       <w:r>
-        <w:t>4.  Hentikan FastAPI, Ollama, dan proses penulisan database secara normal.</w:t>
+        <w:t>4.  Gracefully stop FastAPI, Ollama, and database writes.</w:t>
       </w:r>
     </w:p>
     <w:p>
@@ -10295,7 +10295,7 @@
         <w:ind w:left="374" w:hanging="374"/>
       </w:pPr>
       <w:r>
-        <w:t>5.  Ubah shape A1 dari 4 OCPU dan 24 GB menjadi 2 OCPU dan 12 GB.</w:t>
+        <w:t>5.  Change the shape of A1 from 4 OCPUs and 24 GB to 2 OCPUs and 12 GB.</w:t>
       </w:r>
     </w:p>
     <w:p>
@@ -10304,7 +10304,7 @@
         <w:ind w:left="374" w:hanging="374"/>
       </w:pPr>
       <w:r>
-        <w:t>6.  Nyalakan instance dan jalankan health check serta smoke test.</w:t>
+        <w:t>6.  Restart the instance and run the health check and smoke test.</w:t>
       </w:r>
     </w:p>
     <w:p>
@@ -10313,7 +10313,7 @@
         <w:ind w:left="374" w:hanging="374"/>
       </w:pPr>
       <w:r>
-        <w:t>7.  Gunakan model intent yang lebih kecil jika Qwen 9B tidak lagi sesuai dengan RAM 12 GB.</w:t>
+        <w:t>7.  Use a smaller intent model if the Qwen 9B is no longer compatible with 12 GB of RAM.</w:t>
       </w:r>
     </w:p>
     <w:p>
@@ -10321,7 +10321,7 @@
         <w:pStyle w:val="Heading1"/>
       </w:pPr>
       <w:r>
-        <w:t>Lampiran Konfigurasi Produksi</w:t>
+        <w:t>Production Configuration Appendix</w:t>
       </w:r>
     </w:p>
     <w:p>
@@ -10433,7 +10433,7 @@
         <w:pStyle w:val="BodyText"/>
       </w:pPr>
       <w:r>
-        <w:t>Nilai contract address diisi setelah deployment. API key dan credential tidak boleh dimasukkan ke frontend build atau contoh konfigurasi publik.</w:t>
+        <w:t>The contract address value is filled after deployment. API keys and credentials must not be included in frontend builds or public configuration examples.</w:t>
       </w:r>
     </w:p>
     <w:p>
@@ -10441,7 +10441,7 @@
         <w:pStyle w:val="Heading1"/>
       </w:pPr>
       <w:r>
-        <w:t>Referensi</w:t>
+        <w:t>References</w:t>
       </w:r>
     </w:p>
     <w:p>
@@ -10454,7 +10454,7 @@
             <w:color w:val="2F75B5"/>
             <w:u w:val="single"/>
           </w:rPr>
-          <w:t>Build Week Hackathon Vol 2 Guidebook</w:t>
+          <w:t>Build Week Hackathon Vol. 2 Guidebook</w:t>
         </w:r>
       </w:hyperlink>
     </w:p>
@@ -10468,7 +10468,7 @@
             <w:color w:val="2F75B5"/>
             <w:u w:val="single"/>
           </w:rPr>
-          <w:t>BOT Chain Developer Quick Guide</w:t>
+          <w:t>The BOT Chain Developer Quick Guide</w:t>
         </w:r>
       </w:hyperlink>
     </w:p>

</xml_diff>